<commit_message>
refactor(js): update verify.yml, README.md +30 more - AARADHYA DEV TAMRAKAR (+673/-698)
</commit_message>
<xml_diff>
--- a/assets/docs/AARADHYA_DEV_TAMRAKAR_CV.docx
+++ b/assets/docs/AARADHYA_DEV_TAMRAKAR_CV.docx
@@ -24,12 +24,6 @@
         <w:gridCol w:w="1920"/>
       </w:tblGrid>
       <w:tr>
-        <w:tblPrEx>
-          <w:tblCellMar>
-            <w:top w:w="0" w:type="dxa"/>
-            <w:bottom w:w="0" w:type="dxa"/>
-          </w:tblCellMar>
-        </w:tblPrEx>
         <w:tc>
           <w:tcPr>
             <w:tcW w:w="4100" w:type="pct"/>
@@ -37,7 +31,7 @@
           </w:tcPr>
           <w:p>
             <w:pPr>
-              <w:spacing w:after="40"/>
+              <w:spacing w:after="20"/>
             </w:pPr>
             <w:r>
               <w:rPr>
@@ -48,6 +42,21 @@
                 <w:szCs w:val="32"/>
               </w:rPr>
               <w:t>AARADHYA DEV TAMRAKAR</w:t>
+            </w:r>
+          </w:p>
+          <w:p>
+            <w:pPr>
+              <w:spacing w:after="20"/>
+            </w:pPr>
+            <w:r>
+              <w:rPr>
+                <w:b/>
+                <w:bCs/>
+                <w:color w:val="1F3864"/>
+                <w:sz w:val="19"/>
+                <w:szCs w:val="19"/>
+              </w:rPr>
+              <w:t>AI/ML · Edge AI · Intelligent Systems · Robotics</w:t>
             </w:r>
           </w:p>
           <w:p>
@@ -66,39 +75,8 @@
                   <w:szCs w:val="18"/>
                   <w:u w:val="single"/>
                 </w:rPr>
-                <w:t>linkedin.com/in/</w:t>
+                <w:t>linkedin.com/in/aaradhya-dev-tamrakar</w:t>
               </w:r>
-              <w:proofErr w:type="spellStart"/>
-              <w:r>
-                <w:rPr>
-                  <w:color w:val="1F3864"/>
-                  <w:sz w:val="18"/>
-                  <w:szCs w:val="18"/>
-                  <w:u w:val="single"/>
-                </w:rPr>
-                <w:t>aaradhya</w:t>
-              </w:r>
-              <w:proofErr w:type="spellEnd"/>
-              <w:r>
-                <w:rPr>
-                  <w:color w:val="1F3864"/>
-                  <w:sz w:val="18"/>
-                  <w:szCs w:val="18"/>
-                  <w:u w:val="single"/>
-                </w:rPr>
-                <w:t>-dev-</w:t>
-              </w:r>
-              <w:proofErr w:type="spellStart"/>
-              <w:r>
-                <w:rPr>
-                  <w:color w:val="1F3864"/>
-                  <w:sz w:val="18"/>
-                  <w:szCs w:val="18"/>
-                  <w:u w:val="single"/>
-                </w:rPr>
-                <w:t>tamrakar</w:t>
-              </w:r>
-              <w:proofErr w:type="spellEnd"/>
             </w:hyperlink>
             <w:r>
               <w:rPr>
@@ -115,19 +93,8 @@
                   <w:szCs w:val="18"/>
                   <w:u w:val="single"/>
                 </w:rPr>
-                <w:t>github.com/</w:t>
+                <w:t>github.com/AaradhyaDT</w:t>
               </w:r>
-              <w:proofErr w:type="spellStart"/>
-              <w:r>
-                <w:rPr>
-                  <w:color w:val="1F3864"/>
-                  <w:sz w:val="18"/>
-                  <w:szCs w:val="18"/>
-                  <w:u w:val="single"/>
-                </w:rPr>
-                <w:t>AaradhyaDT</w:t>
-              </w:r>
-              <w:proofErr w:type="spellEnd"/>
             </w:hyperlink>
             <w:r>
               <w:rPr>
@@ -144,25 +111,7 @@
                   <w:szCs w:val="18"/>
                   <w:u w:val="single"/>
                 </w:rPr>
-                <w:t>aaradhya</w:t>
-              </w:r>
-              <w:r>
-                <w:rPr>
-                  <w:color w:val="1F3864"/>
-                  <w:sz w:val="18"/>
-                  <w:szCs w:val="18"/>
-                  <w:u w:val="single"/>
-                </w:rPr>
-                <w:t>dt</w:t>
-              </w:r>
-              <w:r>
-                <w:rPr>
-                  <w:color w:val="1F3864"/>
-                  <w:sz w:val="18"/>
-                  <w:szCs w:val="18"/>
-                  <w:u w:val="single"/>
-                </w:rPr>
-                <w:t>.github.io</w:t>
+                <w:t>aaradhyadt.github.io</w:t>
               </w:r>
             </w:hyperlink>
           </w:p>
@@ -227,15 +176,13 @@
       <w:pPr>
         <w:spacing w:after="100"/>
       </w:pPr>
-      <w:bookmarkStart w:id="0" w:name="_GoBack"/>
-      <w:bookmarkEnd w:id="0"/>
     </w:p>
     <w:p>
       <w:pPr>
         <w:pBdr>
           <w:bottom w:val="single" w:sz="6" w:space="2" w:color="1F3864"/>
         </w:pBdr>
-        <w:spacing w:before="260" w:after="100"/>
+        <w:spacing w:before="180" w:after="70"/>
       </w:pPr>
       <w:r>
         <w:rPr>
@@ -254,29 +201,7 @@
         <w:spacing w:after="120"/>
       </w:pPr>
       <w:r>
-        <w:t>Electronics, Communication and Information student at IOE, Kathmandu Engineering College (Year IV/I). Builds ML pipelines spanning</w:t>
-      </w:r>
-      <w:r>
-        <w:t xml:space="preserve"> classification, regression, tree-based ensembles, and agentic Text-to-SQL systems; deploys via FastAPI and Docker; develops Android apps with Kotlin/Jetpack Compose. Advancing through the </w:t>
-      </w:r>
-      <w:proofErr w:type="spellStart"/>
-      <w:r>
-        <w:t>Fusemachines</w:t>
-      </w:r>
-      <w:proofErr w:type="spellEnd"/>
-      <w:r>
-        <w:t xml:space="preserve"> AI Fellowship and NSSR </w:t>
-      </w:r>
-      <w:proofErr w:type="spellStart"/>
-      <w:r>
-        <w:t>DataCamp</w:t>
-      </w:r>
-      <w:proofErr w:type="spellEnd"/>
-      <w:r>
-        <w:t xml:space="preserve"> Fellowship, while lead</w:t>
-      </w:r>
-      <w:r>
-        <w:t>ing SPARK, an ESP32-S3 edge-AI wearable fall-detection system.</w:t>
+        <w:t>Electronics, Communication and Information Engineering student at IOE, Kathmandu Engineering College, focused on AI/ML, edge AI, responsible AI, and intelligent systems. Builds end-to-end machine learning systems spanning model development, statistical evaluation, explainability, APIs, and deployment, with hands-on experience in ESP32-S3, computer vision, embedded control, and robotics. Currently developing BiasAperture, a fairness-auditing framework for facial-analysis systems, and SPARK, an ESP32-S3 edge-AI wearable fall-detection system.</w:t>
       </w:r>
     </w:p>
     <w:p>
@@ -284,7 +209,7 @@
         <w:pBdr>
           <w:bottom w:val="single" w:sz="6" w:space="2" w:color="1F3864"/>
         </w:pBdr>
-        <w:spacing w:before="260" w:after="100"/>
+        <w:spacing w:before="180" w:after="70"/>
       </w:pPr>
       <w:r>
         <w:rPr>
@@ -303,7 +228,7 @@
         <w:tabs>
           <w:tab w:val="right" w:pos="10080"/>
         </w:tabs>
-        <w:spacing w:before="160" w:after="20"/>
+        <w:spacing w:before="120" w:after="15"/>
       </w:pPr>
       <w:r>
         <w:rPr>
@@ -326,7 +251,7 @@
     </w:p>
     <w:p>
       <w:pPr>
-        <w:spacing w:after="60"/>
+        <w:spacing w:after="15"/>
       </w:pPr>
       <w:r>
         <w:rPr>
@@ -334,7 +259,7 @@
           <w:iCs/>
           <w:color w:val="333333"/>
         </w:rPr>
-        <w:t>Electronics, Communication and Information — Institute of Engineering (IOE), Kathmandu Engineering College | Year IV / Part I</w:t>
+        <w:t>Electronics, Communication and Information — Institute of Engineering (IOE), Kathmandu Engineering College | Year IV / Part II</w:t>
       </w:r>
     </w:p>
     <w:p>
@@ -346,17 +271,25 @@
           <w:b/>
           <w:bCs/>
         </w:rPr>
-        <w:t>Cou</w:t>
-      </w:r>
-      <w:r>
-        <w:rPr>
-          <w:b/>
-          <w:bCs/>
-        </w:rPr>
-        <w:t xml:space="preserve">rsework: </w:t>
+        <w:t xml:space="preserve">Coursework: </w:t>
       </w:r>
       <w:r>
         <w:t>Machine Learning · Signals and Systems · Digital Electronics · Control Systems · Communication Systems</w:t>
+      </w:r>
+    </w:p>
+    <w:p>
+      <w:pPr>
+        <w:spacing w:after="120"/>
+      </w:pPr>
+      <w:r>
+        <w:rPr>
+          <w:b/>
+          <w:bCs/>
+        </w:rPr>
+        <w:t xml:space="preserve">Cumulative Percentage: </w:t>
+      </w:r>
+      <w:r>
+        <w:t>75%</w:t>
       </w:r>
     </w:p>
     <w:p>
@@ -364,7 +297,7 @@
         <w:pBdr>
           <w:bottom w:val="single" w:sz="6" w:space="2" w:color="1F3864"/>
         </w:pBdr>
-        <w:spacing w:before="260" w:after="100"/>
+        <w:spacing w:before="180" w:after="70"/>
       </w:pPr>
       <w:r>
         <w:rPr>
@@ -383,7 +316,7 @@
         <w:tabs>
           <w:tab w:val="right" w:pos="10080"/>
         </w:tabs>
-        <w:spacing w:before="160" w:after="20"/>
+        <w:spacing w:before="120" w:after="15"/>
       </w:pPr>
       <w:r>
         <w:rPr>
@@ -406,7 +339,7 @@
     </w:p>
     <w:p>
       <w:pPr>
-        <w:spacing w:after="60"/>
+        <w:spacing w:after="15"/>
       </w:pPr>
       <w:r>
         <w:rPr>
@@ -424,7 +357,7 @@
           <w:ilvl w:val="0"/>
           <w:numId w:val="2"/>
         </w:numPr>
-        <w:spacing w:after="40"/>
+        <w:spacing w:after="20"/>
       </w:pPr>
       <w:r>
         <w:t>Directed branch strategy, scaling initiatives and member engagement across executive committees.</w:t>
@@ -437,7 +370,7 @@
           <w:ilvl w:val="0"/>
           <w:numId w:val="2"/>
         </w:numPr>
-        <w:spacing w:after="40"/>
+        <w:spacing w:after="20"/>
       </w:pPr>
       <w:r>
         <w:t>Managed relations across the broader technical community.</w:t>
@@ -448,7 +381,7 @@
         <w:tabs>
           <w:tab w:val="right" w:pos="10080"/>
         </w:tabs>
-        <w:spacing w:before="160" w:after="20"/>
+        <w:spacing w:before="120" w:after="15"/>
       </w:pPr>
       <w:r>
         <w:rPr>
@@ -471,7 +404,7 @@
     </w:p>
     <w:p>
       <w:pPr>
-        <w:spacing w:after="60"/>
+        <w:spacing w:after="15"/>
       </w:pPr>
       <w:r>
         <w:rPr>
@@ -489,13 +422,10 @@
           <w:ilvl w:val="0"/>
           <w:numId w:val="2"/>
         </w:numPr>
-        <w:spacing w:after="40"/>
-      </w:pPr>
-      <w:r>
-        <w:t>Coordinate</w:t>
-      </w:r>
-      <w:r>
-        <w:t>d logistics for club workshops and department activities.</w:t>
+        <w:spacing w:after="20"/>
+      </w:pPr>
+      <w:r>
+        <w:t>Coordinated logistics for club workshops and department activities.</w:t>
       </w:r>
     </w:p>
     <w:p>
@@ -503,7 +433,7 @@
         <w:tabs>
           <w:tab w:val="right" w:pos="10080"/>
         </w:tabs>
-        <w:spacing w:before="160" w:after="20"/>
+        <w:spacing w:before="120" w:after="15"/>
       </w:pPr>
       <w:r>
         <w:rPr>
@@ -526,7 +456,7 @@
     </w:p>
     <w:p>
       <w:pPr>
-        <w:spacing w:after="60"/>
+        <w:spacing w:after="15"/>
       </w:pPr>
       <w:r>
         <w:rPr>
@@ -544,18 +474,10 @@
           <w:ilvl w:val="0"/>
           <w:numId w:val="2"/>
         </w:numPr>
-        <w:spacing w:after="40"/>
-      </w:pPr>
-      <w:r>
-        <w:t xml:space="preserve">Shipped site-wide fixes to the Maker’s Space website — image repair, content consistency, UI </w:t>
-      </w:r>
-      <w:proofErr w:type="spellStart"/>
-      <w:r>
-        <w:t>cleanup</w:t>
-      </w:r>
-      <w:proofErr w:type="spellEnd"/>
-      <w:r>
-        <w:t>.</w:t>
+        <w:spacing w:after="20"/>
+      </w:pPr>
+      <w:r>
+        <w:t>Shipped site-wide fixes to the Maker’s Space website — image repair, content consistency, UI cleanup.</w:t>
       </w:r>
     </w:p>
     <w:p>
@@ -563,7 +485,7 @@
         <w:tabs>
           <w:tab w:val="right" w:pos="10080"/>
         </w:tabs>
-        <w:spacing w:before="160" w:after="20"/>
+        <w:spacing w:before="120" w:after="15"/>
       </w:pPr>
       <w:r>
         <w:rPr>
@@ -572,16 +494,7 @@
           <w:sz w:val="21"/>
           <w:szCs w:val="21"/>
         </w:rPr>
-        <w:t xml:space="preserve">Vice </w:t>
-      </w:r>
-      <w:r>
-        <w:rPr>
-          <w:b/>
-          <w:bCs/>
-          <w:sz w:val="21"/>
-          <w:szCs w:val="21"/>
-        </w:rPr>
-        <w:t>Secretary</w:t>
+        <w:t>Vice Secretary</w:t>
       </w:r>
       <w:r>
         <w:rPr>
@@ -595,7 +508,7 @@
     </w:p>
     <w:p>
       <w:pPr>
-        <w:spacing w:after="60"/>
+        <w:spacing w:after="15"/>
       </w:pPr>
       <w:r>
         <w:rPr>
@@ -613,7 +526,7 @@
           <w:ilvl w:val="0"/>
           <w:numId w:val="2"/>
         </w:numPr>
-        <w:spacing w:after="40"/>
+        <w:spacing w:after="20"/>
       </w:pPr>
       <w:r>
         <w:t>Streamlined operations and grew program participation by managing documentation and orchestrating workshop logistics.</w:t>
@@ -626,7 +539,7 @@
           <w:ilvl w:val="0"/>
           <w:numId w:val="2"/>
         </w:numPr>
-        <w:spacing w:after="40"/>
+        <w:spacing w:after="20"/>
       </w:pPr>
       <w:r>
         <w:t>Coordinated volunteers alongside the committee for seamless execution.</w:t>
@@ -637,7 +550,7 @@
         <w:tabs>
           <w:tab w:val="right" w:pos="10080"/>
         </w:tabs>
-        <w:spacing w:before="160" w:after="20"/>
+        <w:spacing w:before="120" w:after="15"/>
       </w:pPr>
       <w:r>
         <w:rPr>
@@ -660,7 +573,7 @@
     </w:p>
     <w:p>
       <w:pPr>
-        <w:spacing w:after="60"/>
+        <w:spacing w:after="15"/>
       </w:pPr>
       <w:r>
         <w:rPr>
@@ -678,7 +591,7 @@
           <w:ilvl w:val="0"/>
           <w:numId w:val="2"/>
         </w:numPr>
-        <w:spacing w:after="40"/>
+        <w:spacing w:after="20"/>
       </w:pPr>
       <w:r>
         <w:t>Allocated scheduling and resources for workshops across multiple departments.</w:t>
@@ -689,7 +602,7 @@
         <w:pBdr>
           <w:bottom w:val="single" w:sz="6" w:space="2" w:color="1F3864"/>
         </w:pBdr>
-        <w:spacing w:before="260" w:after="100"/>
+        <w:spacing w:before="180" w:after="70"/>
       </w:pPr>
       <w:r>
         <w:rPr>
@@ -708,7 +621,7 @@
         <w:tabs>
           <w:tab w:val="right" w:pos="10080"/>
         </w:tabs>
-        <w:spacing w:before="160" w:after="20"/>
+        <w:spacing w:before="120" w:after="15"/>
       </w:pPr>
       <w:r>
         <w:rPr>
@@ -717,27 +630,7 @@
           <w:sz w:val="21"/>
           <w:szCs w:val="21"/>
         </w:rPr>
-        <w:t xml:space="preserve">Fuse AI Fellow — </w:t>
-      </w:r>
-      <w:proofErr w:type="spellStart"/>
-      <w:r>
-        <w:rPr>
-          <w:b/>
-          <w:bCs/>
-          <w:sz w:val="21"/>
-          <w:szCs w:val="21"/>
-        </w:rPr>
-        <w:t>Fusemachines</w:t>
-      </w:r>
-      <w:proofErr w:type="spellEnd"/>
-      <w:r>
-        <w:rPr>
-          <w:b/>
-          <w:bCs/>
-          <w:sz w:val="21"/>
-          <w:szCs w:val="21"/>
-        </w:rPr>
-        <w:t xml:space="preserve"> AI Fellowship 2026</w:t>
+        <w:t>Fuse AI Fellow — Fusemachines AI Fellowship 2026</w:t>
       </w:r>
       <w:r>
         <w:rPr>
@@ -751,9 +644,8 @@
     </w:p>
     <w:p>
       <w:pPr>
-        <w:spacing w:after="60"/>
-      </w:pPr>
-      <w:proofErr w:type="spellStart"/>
+        <w:spacing w:after="15"/>
+      </w:pPr>
       <w:r>
         <w:rPr>
           <w:i/>
@@ -762,172 +654,70 @@
         </w:rPr>
         <w:t>Fusemachines</w:t>
       </w:r>
-      <w:proofErr w:type="spellEnd"/>
-    </w:p>
-    <w:p>
-      <w:pPr>
-        <w:pStyle w:val="ListParagraph"/>
-        <w:numPr>
-          <w:ilvl w:val="0"/>
-          <w:numId w:val="2"/>
-        </w:numPr>
-        <w:spacing w:after="40"/>
-      </w:pPr>
-      <w:r>
-        <w:t>Qualifi</w:t>
-      </w:r>
-      <w:r>
-        <w:t xml:space="preserve">ed through the </w:t>
-      </w:r>
-      <w:proofErr w:type="spellStart"/>
-      <w:r>
-        <w:t>Fusemachines</w:t>
-      </w:r>
-      <w:proofErr w:type="spellEnd"/>
-      <w:r>
-        <w:t xml:space="preserve"> AI Fellowship entrance exam (March 2026): linear algebra, calculus, probability, Python, ML.</w:t>
-      </w:r>
-    </w:p>
-    <w:p>
-      <w:pPr>
-        <w:pStyle w:val="ListParagraph"/>
-        <w:numPr>
-          <w:ilvl w:val="0"/>
-          <w:numId w:val="2"/>
-        </w:numPr>
-        <w:spacing w:after="40"/>
-      </w:pPr>
-      <w:r>
-        <w:t>Developed a containerized REST API with FastAPI, PostgreSQL, and Docker.</w:t>
-      </w:r>
-    </w:p>
-    <w:p>
-      <w:pPr>
-        <w:pStyle w:val="ListParagraph"/>
-        <w:numPr>
-          <w:ilvl w:val="0"/>
-          <w:numId w:val="2"/>
-        </w:numPr>
-        <w:spacing w:after="40"/>
-      </w:pPr>
-      <w:r>
-        <w:t xml:space="preserve">Engineered a five-stage agentic Text-to-SQL pipeline (Planner </w:t>
-      </w:r>
-      <w:r>
-        <w:t>→ Generator → Validator → Executor → Summarizer).</w:t>
-      </w:r>
-    </w:p>
-    <w:p>
-      <w:pPr>
-        <w:pStyle w:val="ListParagraph"/>
-        <w:numPr>
-          <w:ilvl w:val="0"/>
-          <w:numId w:val="2"/>
-        </w:numPr>
-        <w:spacing w:after="40"/>
-      </w:pPr>
-      <w:r>
-        <w:t>Validated the five-stage Text-to-SQL pipeline at 100% execution success and accuracy on a 50-question benchmark.</w:t>
-      </w:r>
-    </w:p>
-    <w:p>
-      <w:pPr>
-        <w:pStyle w:val="ListParagraph"/>
-        <w:numPr>
-          <w:ilvl w:val="0"/>
-          <w:numId w:val="2"/>
-        </w:numPr>
-        <w:spacing w:after="40"/>
-      </w:pPr>
-      <w:r>
-        <w:t>Created an end-to-end churn and CLV pipeline achieving 5-fold CV ROC-AUC 0.841, threshold-tun</w:t>
-      </w:r>
-      <w:r>
-        <w:t>ed for the top-200 high-risk segment.</w:t>
-      </w:r>
-    </w:p>
-    <w:p>
-      <w:pPr>
-        <w:pStyle w:val="ListParagraph"/>
-        <w:numPr>
-          <w:ilvl w:val="0"/>
-          <w:numId w:val="2"/>
-        </w:numPr>
-        <w:spacing w:after="40"/>
-      </w:pPr>
-      <w:r>
-        <w:t xml:space="preserve">Trained Random Forest and </w:t>
-      </w:r>
-      <w:proofErr w:type="spellStart"/>
-      <w:r>
-        <w:t>XGBoost</w:t>
-      </w:r>
-      <w:proofErr w:type="spellEnd"/>
-      <w:r>
-        <w:t xml:space="preserve"> ensembles with SMOTE and SHAP </w:t>
-      </w:r>
-      <w:proofErr w:type="spellStart"/>
-      <w:r>
-        <w:t>explainability</w:t>
-      </w:r>
-      <w:proofErr w:type="spellEnd"/>
-      <w:r>
-        <w:t>.</w:t>
-      </w:r>
-    </w:p>
-    <w:p>
-      <w:pPr>
-        <w:pStyle w:val="ListParagraph"/>
-        <w:numPr>
-          <w:ilvl w:val="0"/>
-          <w:numId w:val="2"/>
-        </w:numPr>
-        <w:spacing w:after="40"/>
-      </w:pPr>
-      <w:r>
-        <w:t xml:space="preserve">Implemented probabilistic models spanning Bayesian estimation and Gaussian process regression via </w:t>
-      </w:r>
-      <w:proofErr w:type="spellStart"/>
-      <w:r>
-        <w:t>PyMC</w:t>
-      </w:r>
-      <w:proofErr w:type="spellEnd"/>
-      <w:r>
-        <w:t>/</w:t>
-      </w:r>
-      <w:proofErr w:type="spellStart"/>
-      <w:r>
-        <w:t>ArviZ</w:t>
-      </w:r>
-      <w:proofErr w:type="spellEnd"/>
-      <w:r>
-        <w:t>.</w:t>
-      </w:r>
-    </w:p>
-    <w:p>
-      <w:pPr>
-        <w:pStyle w:val="ListParagraph"/>
-        <w:numPr>
-          <w:ilvl w:val="0"/>
-          <w:numId w:val="2"/>
-        </w:numPr>
-        <w:spacing w:after="40"/>
-      </w:pPr>
-      <w:r>
-        <w:t>Segmented customers on UCI Online Retail II (~500K transactions) using K-Means and DBSCAN; delivered an executive narrative.</w:t>
-      </w:r>
-    </w:p>
-    <w:p>
-      <w:pPr>
-        <w:pStyle w:val="ListParagraph"/>
-        <w:numPr>
-          <w:ilvl w:val="0"/>
-          <w:numId w:val="2"/>
-        </w:numPr>
-        <w:spacing w:after="40"/>
-      </w:pPr>
-      <w:r>
-        <w:t>Benchmarked nine forecasting models; built a four-model ensemble that achieved MASE 2.44.</w:t>
+    </w:p>
+    <w:p>
+      <w:pPr>
+        <w:pStyle w:val="ListParagraph"/>
+        <w:numPr>
+          <w:ilvl w:val="0"/>
+          <w:numId w:val="2"/>
+        </w:numPr>
+        <w:spacing w:after="20"/>
+      </w:pPr>
+      <w:r>
+        <w:t>Engineered a five-stage agentic Text-to-SQL pipeline (Planner → Generator → Validator → Executor → Summarizer), achieving 100% execution success and accuracy on a 50-question benchmark.</w:t>
+      </w:r>
+    </w:p>
+    <w:p>
+      <w:pPr>
+        <w:pStyle w:val="ListParagraph"/>
+        <w:numPr>
+          <w:ilvl w:val="0"/>
+          <w:numId w:val="2"/>
+        </w:numPr>
+        <w:spacing w:after="20"/>
+      </w:pPr>
+      <w:r>
+        <w:t>Built containerized AI services using FastAPI, PostgreSQL, and Docker.</w:t>
+      </w:r>
+    </w:p>
+    <w:p>
+      <w:pPr>
+        <w:pStyle w:val="ListParagraph"/>
+        <w:numPr>
+          <w:ilvl w:val="0"/>
+          <w:numId w:val="2"/>
+        </w:numPr>
+        <w:spacing w:after="20"/>
+      </w:pPr>
+      <w:r>
+        <w:t>Developed a churn/CLV pipeline achieving 5-fold CV ROC-AUC 0.841, with threshold tuning and SHAP explainability.</w:t>
+      </w:r>
+    </w:p>
+    <w:p>
+      <w:pPr>
+        <w:pStyle w:val="ListParagraph"/>
+        <w:numPr>
+          <w:ilvl w:val="0"/>
+          <w:numId w:val="2"/>
+        </w:numPr>
+        <w:spacing w:after="20"/>
+      </w:pPr>
+      <w:r>
+        <w:t>Applied Random Forest, XGBoost, Bayesian inference, Gaussian processes, clustering, and forecasting across applied datasets.</w:t>
+      </w:r>
+    </w:p>
+    <w:p>
+      <w:pPr>
+        <w:pStyle w:val="ListParagraph"/>
+        <w:numPr>
+          <w:ilvl w:val="0"/>
+          <w:numId w:val="2"/>
+        </w:numPr>
+        <w:spacing w:after="20"/>
+      </w:pPr>
+      <w:r>
+        <w:t>Worked with UCI Online Retail II (~500K transactions) for segmentation and forecasting, achieving MASE 2.44 with a four-model ensemble.</w:t>
       </w:r>
     </w:p>
     <w:p>
@@ -935,7 +725,7 @@
         <w:tabs>
           <w:tab w:val="right" w:pos="10080"/>
         </w:tabs>
-        <w:spacing w:before="160" w:after="20"/>
+        <w:spacing w:before="120" w:after="15"/>
       </w:pPr>
       <w:r>
         <w:rPr>
@@ -944,27 +734,7 @@
           <w:sz w:val="21"/>
           <w:szCs w:val="21"/>
         </w:rPr>
-        <w:t xml:space="preserve">NSSR </w:t>
-      </w:r>
-      <w:proofErr w:type="spellStart"/>
-      <w:r>
-        <w:rPr>
-          <w:b/>
-          <w:bCs/>
-          <w:sz w:val="21"/>
-          <w:szCs w:val="21"/>
-        </w:rPr>
-        <w:t>DataCamp</w:t>
-      </w:r>
-      <w:proofErr w:type="spellEnd"/>
-      <w:r>
-        <w:rPr>
-          <w:b/>
-          <w:bCs/>
-          <w:sz w:val="21"/>
-          <w:szCs w:val="21"/>
-        </w:rPr>
-        <w:t xml:space="preserve"> Fellow — Cohort 2</w:t>
+        <w:t>NSSR DataCamp Fellow — Cohort 2</w:t>
       </w:r>
       <w:r>
         <w:rPr>
@@ -973,27 +743,19 @@
           <w:color w:val="333333"/>
         </w:rPr>
         <w:tab/>
-        <w:t>2026 – Pr</w:t>
-      </w:r>
+        <w:t>2026 – Present</w:t>
+      </w:r>
+    </w:p>
+    <w:p>
+      <w:pPr>
+        <w:spacing w:after="15"/>
+      </w:pPr>
       <w:r>
         <w:rPr>
           <w:i/>
           <w:iCs/>
           <w:color w:val="333333"/>
         </w:rPr>
-        <w:t>esent</w:t>
-      </w:r>
-    </w:p>
-    <w:p>
-      <w:pPr>
-        <w:spacing w:after="60"/>
-      </w:pPr>
-      <w:r>
-        <w:rPr>
-          <w:i/>
-          <w:iCs/>
-          <w:color w:val="333333"/>
-        </w:rPr>
         <w:t>Nepalese Society of Student Researchers</w:t>
       </w:r>
     </w:p>
@@ -1004,55 +766,36 @@
           <w:ilvl w:val="0"/>
           <w:numId w:val="2"/>
         </w:numPr>
-        <w:spacing w:after="40"/>
-      </w:pPr>
-      <w:r>
-        <w:t xml:space="preserve">Secured competitive selection (April 2026) for a sponsored </w:t>
-      </w:r>
-      <w:proofErr w:type="spellStart"/>
-      <w:r>
-        <w:t>DataCamp</w:t>
-      </w:r>
-      <w:proofErr w:type="spellEnd"/>
-      <w:r>
-        <w:t xml:space="preserve"> Premium license, one of a limited cohort.</w:t>
-      </w:r>
-    </w:p>
-    <w:p>
-      <w:pPr>
-        <w:pStyle w:val="ListParagraph"/>
-        <w:numPr>
-          <w:ilvl w:val="0"/>
-          <w:numId w:val="2"/>
-        </w:numPr>
-        <w:spacing w:after="40"/>
+        <w:spacing w:after="20"/>
+      </w:pPr>
+      <w:r>
+        <w:t>Secured competitive selection (April 2026) for a sponsored DataCamp Premium license, one of a limited cohort.</w:t>
+      </w:r>
+    </w:p>
+    <w:p>
+      <w:pPr>
+        <w:pStyle w:val="ListParagraph"/>
+        <w:numPr>
+          <w:ilvl w:val="0"/>
+          <w:numId w:val="2"/>
+        </w:numPr>
+        <w:spacing w:after="20"/>
+      </w:pPr>
+      <w:r>
+        <w:t>Delivered six applied GenAI solutions, automating null filtering, deduplication, and schema normalization across product and data workflows.</w:t>
+      </w:r>
+    </w:p>
+    <w:p>
+      <w:pPr>
+        <w:pStyle w:val="ListParagraph"/>
+        <w:numPr>
+          <w:ilvl w:val="0"/>
+          <w:numId w:val="2"/>
+        </w:numPr>
+        <w:spacing w:after="20"/>
       </w:pPr>
       <w:r>
         <w:lastRenderedPageBreak/>
-        <w:t xml:space="preserve">Delivered six applied </w:t>
-      </w:r>
-      <w:proofErr w:type="spellStart"/>
-      <w:r>
-        <w:t>GenAI</w:t>
-      </w:r>
-      <w:proofErr w:type="spellEnd"/>
-      <w:r>
-        <w:t xml:space="preserve"> solutions, automating null filtering, deduplication, and schema normaliz</w:t>
-      </w:r>
-      <w:r>
-        <w:t>ation across product and data workflows.</w:t>
-      </w:r>
-    </w:p>
-    <w:p>
-      <w:pPr>
-        <w:pStyle w:val="ListParagraph"/>
-        <w:numPr>
-          <w:ilvl w:val="0"/>
-          <w:numId w:val="2"/>
-        </w:numPr>
-        <w:spacing w:after="40"/>
-      </w:pPr>
-      <w:r>
         <w:t>Completed coursework toward SQL Associate and Python Data Associate certifications in PostgreSQL, Pandas, statistics, and scikit-learn.</w:t>
       </w:r>
     </w:p>
@@ -1061,7 +804,7 @@
         <w:pBdr>
           <w:bottom w:val="single" w:sz="6" w:space="2" w:color="1F3864"/>
         </w:pBdr>
-        <w:spacing w:before="260" w:after="100"/>
+        <w:spacing w:before="180" w:after="70"/>
       </w:pPr>
       <w:r>
         <w:rPr>
@@ -1077,7 +820,7 @@
     </w:p>
     <w:p>
       <w:pPr>
-        <w:spacing w:before="140" w:after="10"/>
+        <w:spacing w:before="100" w:after="8"/>
       </w:pPr>
       <w:r>
         <w:rPr>
@@ -1086,12 +829,12 @@
           <w:sz w:val="21"/>
           <w:szCs w:val="21"/>
         </w:rPr>
-        <w:t>SPARK — Wearable Fall Detection System (Major Project)</w:t>
-      </w:r>
-    </w:p>
-    <w:p>
-      <w:pPr>
-        <w:spacing w:after="50"/>
+        <w:t>BiasAperture — Vision Fairness &amp; Bias Audit (Fellowship Capstone)</w:t>
+      </w:r>
+    </w:p>
+    <w:p>
+      <w:pPr>
+        <w:spacing w:after="30"/>
       </w:pPr>
       <w:r>
         <w:rPr>
@@ -1101,8 +844,66 @@
           <w:sz w:val="19"/>
           <w:szCs w:val="19"/>
         </w:rPr>
-        <w:t>ESP32-S3 · Tens</w:t>
-      </w:r>
+        <w:t>AIF360 · Fairlearn · FairFace · UTKFace · SHAP · Statistical Testing</w:t>
+      </w:r>
+    </w:p>
+    <w:p>
+      <w:pPr>
+        <w:pStyle w:val="ListParagraph"/>
+        <w:numPr>
+          <w:ilvl w:val="0"/>
+          <w:numId w:val="2"/>
+        </w:numPr>
+        <w:spacing w:after="20"/>
+      </w:pPr>
+      <w:r>
+        <w:t>Developed a fairness-auditing framework for facial-analysis classifiers, generating structured reports aligned with EU AI Act Article 10 and NIST AI RMF concepts.</w:t>
+      </w:r>
+    </w:p>
+    <w:p>
+      <w:pPr>
+        <w:pStyle w:val="ListParagraph"/>
+        <w:numPr>
+          <w:ilvl w:val="0"/>
+          <w:numId w:val="2"/>
+        </w:numPr>
+        <w:spacing w:after="20"/>
+      </w:pPr>
+      <w:r>
+        <w:t>Computes DPD, EOD, EOP, and DIR across 126 demographic bins (race × age × gender) with χ² significance tests and BCa bootstrap confidence intervals.</w:t>
+      </w:r>
+    </w:p>
+    <w:p>
+      <w:pPr>
+        <w:pStyle w:val="ListParagraph"/>
+        <w:numPr>
+          <w:ilvl w:val="0"/>
+          <w:numId w:val="2"/>
+        </w:numPr>
+        <w:spacing w:after="20"/>
+      </w:pPr>
+      <w:r>
+        <w:t>Fusemachines AI Fellowship Capstone, two-person team with Tisha Manandhar; 4 of 5 milestones complete (Schema Lock through Statistical Engine).</w:t>
+      </w:r>
+    </w:p>
+    <w:p>
+      <w:pPr>
+        <w:spacing w:before="100" w:after="8"/>
+      </w:pPr>
+      <w:r>
+        <w:rPr>
+          <w:b/>
+          <w:bCs/>
+          <w:sz w:val="21"/>
+          <w:szCs w:val="21"/>
+        </w:rPr>
+        <w:t>SPARK — Wearable Fall Detection System (Major Project)</w:t>
+      </w:r>
+    </w:p>
+    <w:p>
+      <w:pPr>
+        <w:spacing w:after="30"/>
+      </w:pPr>
       <w:r>
         <w:rPr>
           <w:i/>
@@ -1111,91 +912,51 @@
           <w:sz w:val="19"/>
           <w:szCs w:val="19"/>
         </w:rPr>
-        <w:t>orFlow Lite Micro · SHAP · MQTT · FastAPI · PostgreSQL</w:t>
-      </w:r>
-    </w:p>
-    <w:p>
-      <w:pPr>
-        <w:pStyle w:val="ListParagraph"/>
-        <w:numPr>
-          <w:ilvl w:val="0"/>
-          <w:numId w:val="2"/>
-        </w:numPr>
-        <w:spacing w:after="40"/>
-      </w:pPr>
-      <w:r>
-        <w:t>Designed a two-layer ESP32-S3 fall-detection system combining a &lt;5ms threshold gate with an INT8 1D CNN confirmation layer under 100ms.</w:t>
-      </w:r>
-    </w:p>
-    <w:p>
-      <w:pPr>
-        <w:pStyle w:val="ListParagraph"/>
-        <w:numPr>
-          <w:ilvl w:val="0"/>
-          <w:numId w:val="2"/>
-        </w:numPr>
-        <w:spacing w:after="40"/>
-      </w:pPr>
-      <w:r>
-        <w:t>Computed per-event SHAP explanations at a local, non-cloud gatewa</w:t>
-      </w:r>
-      <w:r>
-        <w:t>y.</w:t>
-      </w:r>
-    </w:p>
-    <w:p>
-      <w:pPr>
-        <w:pStyle w:val="ListParagraph"/>
-        <w:numPr>
-          <w:ilvl w:val="0"/>
-          <w:numId w:val="2"/>
-        </w:numPr>
-        <w:spacing w:after="40"/>
-      </w:pPr>
-      <w:r>
-        <w:t>Presented the SPARK project proposal to the review panel; demo targeted for March 2027.</w:t>
-      </w:r>
-    </w:p>
-    <w:p>
-      <w:pPr>
-        <w:pStyle w:val="ListParagraph"/>
-        <w:numPr>
-          <w:ilvl w:val="0"/>
-          <w:numId w:val="2"/>
-        </w:numPr>
-        <w:spacing w:after="40"/>
-      </w:pPr>
-      <w:r>
-        <w:t xml:space="preserve">Led the AI and backend work package (WP 1.0) — CNN training pipeline, FastAPI/PostgreSQL gateway — within a 4-person team supervised by </w:t>
-      </w:r>
-      <w:proofErr w:type="spellStart"/>
-      <w:r>
-        <w:t>Er</w:t>
-      </w:r>
-      <w:proofErr w:type="spellEnd"/>
-      <w:r>
-        <w:t xml:space="preserve">. </w:t>
-      </w:r>
-      <w:proofErr w:type="spellStart"/>
-      <w:r>
-        <w:t>Dipen</w:t>
-      </w:r>
-      <w:proofErr w:type="spellEnd"/>
-      <w:r>
-        <w:t xml:space="preserve"> </w:t>
-      </w:r>
-      <w:proofErr w:type="spellStart"/>
-      <w:r>
-        <w:t>Manandhar</w:t>
-      </w:r>
-      <w:proofErr w:type="spellEnd"/>
-      <w:r>
-        <w:t>.</w:t>
-      </w:r>
-    </w:p>
-    <w:p>
-      <w:pPr>
-        <w:spacing w:before="140" w:after="10"/>
+        <w:t>ESP32-S3 · TensorFlow Lite Micro · SHAP · MQTT · FastAPI · PostgreSQL</w:t>
+      </w:r>
+    </w:p>
+    <w:p>
+      <w:pPr>
+        <w:pStyle w:val="ListParagraph"/>
+        <w:numPr>
+          <w:ilvl w:val="0"/>
+          <w:numId w:val="2"/>
+        </w:numPr>
+        <w:spacing w:after="20"/>
+      </w:pPr>
+      <w:r>
+        <w:t>Designed a two-layer ESP32-S3 fall-detection system combining a &lt;5ms threshold gate with an INT8 1D CNN confirmation layer under 100ms, reaching 0.919 AUC-ROC on the SisFall benchmark (subject-grouped 5-fold CV, 38,420 windows).</w:t>
+      </w:r>
+    </w:p>
+    <w:p>
+      <w:pPr>
+        <w:pStyle w:val="ListParagraph"/>
+        <w:numPr>
+          <w:ilvl w:val="0"/>
+          <w:numId w:val="2"/>
+        </w:numPr>
+        <w:spacing w:after="20"/>
+      </w:pPr>
+      <w:r>
+        <w:t>Computes per-event SHAP explanations at a local, non-cloud gateway; proposal presented to the review panel, demo targeted for March 2027.</w:t>
+      </w:r>
+    </w:p>
+    <w:p>
+      <w:pPr>
+        <w:pStyle w:val="ListParagraph"/>
+        <w:numPr>
+          <w:ilvl w:val="0"/>
+          <w:numId w:val="2"/>
+        </w:numPr>
+        <w:spacing w:after="20"/>
+      </w:pPr>
+      <w:r>
+        <w:t>Led the AI and backend work package (WP 1.0) — CNN training pipeline, FastAPI/PostgreSQL gateway — within a 4-person team supervised by Er. Dipen Manandhar.</w:t>
+      </w:r>
+    </w:p>
+    <w:p>
+      <w:pPr>
+        <w:spacing w:before="100" w:after="8"/>
       </w:pPr>
       <w:r>
         <w:rPr>
@@ -1204,21 +965,12 @@
           <w:sz w:val="21"/>
           <w:szCs w:val="21"/>
         </w:rPr>
-        <w:t>Gesture-</w:t>
-      </w:r>
-      <w:r>
-        <w:rPr>
-          <w:b/>
-          <w:bCs/>
-          <w:sz w:val="21"/>
-          <w:szCs w:val="21"/>
-        </w:rPr>
-        <w:t>Controlled Self-Balancing Robot (GCSBR) — Minor Project</w:t>
-      </w:r>
-    </w:p>
-    <w:p>
-      <w:pPr>
-        <w:spacing w:after="50"/>
+        <w:t>Gesture-Controlled Self-Balancing Robot (GCSBR) — Minor Project</w:t>
+      </w:r>
+    </w:p>
+    <w:p>
+      <w:pPr>
+        <w:spacing w:after="30"/>
       </w:pPr>
       <w:r>
         <w:rPr>
@@ -1230,60 +982,38 @@
         </w:rPr>
         <w:t>Computer Vision · Arduino · MPU6050 · Stepper Motors · Android · MATLAB</w:t>
       </w:r>
-    </w:p>
-    <w:p>
-      <w:pPr>
-        <w:pStyle w:val="ListParagraph"/>
-        <w:numPr>
-          <w:ilvl w:val="0"/>
-          <w:numId w:val="2"/>
-        </w:numPr>
-        <w:spacing w:after="40"/>
-      </w:pPr>
-      <w:r>
-        <w:t>Earned a 'major project level' rating from the examiner.</w:t>
-      </w:r>
-    </w:p>
-    <w:p>
-      <w:pPr>
-        <w:pStyle w:val="ListParagraph"/>
-        <w:numPr>
-          <w:ilvl w:val="0"/>
-          <w:numId w:val="2"/>
-        </w:numPr>
-        <w:spacing w:after="40"/>
-      </w:pPr>
-      <w:r>
-        <w:t>Implemented PID stabilization firmware, validated via a MATLAB-simulati</w:t>
-      </w:r>
-      <w:r>
-        <w:t>on-to-hardware pipeline.</w:t>
-      </w:r>
-    </w:p>
-    <w:p>
-      <w:pPr>
-        <w:pStyle w:val="ListParagraph"/>
-        <w:numPr>
-          <w:ilvl w:val="0"/>
-          <w:numId w:val="2"/>
-        </w:numPr>
-        <w:spacing w:after="40"/>
-      </w:pPr>
-      <w:r>
-        <w:t xml:space="preserve">Developed an Android gesture-control app (MediaPipe, </w:t>
-      </w:r>
-      <w:proofErr w:type="spellStart"/>
-      <w:r>
-        <w:t>CameraX</w:t>
-      </w:r>
-      <w:proofErr w:type="spellEnd"/>
-      <w:r>
-        <w:t>, HC-05 BT) driving motors for real-time actuation.</w:t>
-      </w:r>
-    </w:p>
-    <w:p>
-      <w:pPr>
-        <w:spacing w:before="140" w:after="10"/>
+      <w:bookmarkStart w:id="0" w:name="_GoBack"/>
+      <w:bookmarkEnd w:id="0"/>
+    </w:p>
+    <w:p>
+      <w:pPr>
+        <w:pStyle w:val="ListParagraph"/>
+        <w:numPr>
+          <w:ilvl w:val="0"/>
+          <w:numId w:val="2"/>
+        </w:numPr>
+        <w:spacing w:after="20"/>
+      </w:pPr>
+      <w:r>
+        <w:t>Implemented PID stabilization firmware, validated via a MATLAB-simulation-to-hardware pipeline.</w:t>
+      </w:r>
+    </w:p>
+    <w:p>
+      <w:pPr>
+        <w:pStyle w:val="ListParagraph"/>
+        <w:numPr>
+          <w:ilvl w:val="0"/>
+          <w:numId w:val="2"/>
+        </w:numPr>
+        <w:spacing w:after="20"/>
+      </w:pPr>
+      <w:r>
+        <w:t>Developed an Android gesture-control app (MediaPipe, CameraX, HC-05 BT) driving motors for real-time actuation.</w:t>
+      </w:r>
+    </w:p>
+    <w:p>
+      <w:pPr>
+        <w:spacing w:before="100" w:after="8"/>
       </w:pPr>
       <w:r>
         <w:rPr>
@@ -1297,7 +1027,7 @@
     </w:p>
     <w:p>
       <w:pPr>
-        <w:spacing w:after="50"/>
+        <w:spacing w:after="30"/>
       </w:pPr>
       <w:r>
         <w:rPr>
@@ -1317,18 +1047,15 @@
           <w:ilvl w:val="0"/>
           <w:numId w:val="2"/>
         </w:numPr>
-        <w:spacing w:after="40"/>
-      </w:pPr>
-      <w:r>
-        <w:t>Predicted platform stability from simulated</w:t>
-      </w:r>
-      <w:r>
-        <w:t xml:space="preserve"> IMU data using a Random Forest model, reaching 99.8% test accuracy; served via FastAPI.</w:t>
-      </w:r>
-    </w:p>
-    <w:p>
-      <w:pPr>
-        <w:spacing w:before="140" w:after="10"/>
+        <w:spacing w:after="20"/>
+      </w:pPr>
+      <w:r>
+        <w:t>Predicted platform stability from simulated IMU data using a Random Forest model, reaching 99.8% test accuracy; served via FastAPI with Joblib export for integration into GCSBR.</w:t>
+      </w:r>
+    </w:p>
+    <w:p>
+      <w:pPr>
+        <w:spacing w:before="100" w:after="8"/>
       </w:pPr>
       <w:r>
         <w:rPr>
@@ -1342,7 +1069,7 @@
     </w:p>
     <w:p>
       <w:pPr>
-        <w:spacing w:after="50"/>
+        <w:spacing w:after="30"/>
       </w:pPr>
       <w:r>
         <w:rPr>
@@ -1352,9 +1079,40 @@
           <w:sz w:val="19"/>
           <w:szCs w:val="19"/>
         </w:rPr>
-        <w:t xml:space="preserve">Kotlin · Jetpack Compose · Material3 · </w:t>
-      </w:r>
-      <w:proofErr w:type="spellStart"/>
+        <w:t>Kotlin · Jetpack Compose · Material3 · DataStore · Apache POI</w:t>
+      </w:r>
+    </w:p>
+    <w:p>
+      <w:pPr>
+        <w:pStyle w:val="ListParagraph"/>
+        <w:numPr>
+          <w:ilvl w:val="0"/>
+          <w:numId w:val="2"/>
+        </w:numPr>
+        <w:spacing w:after="20"/>
+      </w:pPr>
+      <w:r>
+        <w:t>Modular Android super-app (Kotlin/Jetpack Compose, Material3) — gesture remote, budget tracker, and multi-mode calculator; calculator is the primary shipping target, with Play Store release in progress.</w:t>
+      </w:r>
+    </w:p>
+    <w:p>
+      <w:pPr>
+        <w:spacing w:before="100" w:after="8"/>
+      </w:pPr>
+      <w:r>
+        <w:rPr>
+          <w:b/>
+          <w:bCs/>
+          <w:sz w:val="21"/>
+          <w:szCs w:val="21"/>
+        </w:rPr>
+        <w:t>Nexus — Personal AI Operating System</w:t>
+      </w:r>
+    </w:p>
+    <w:p>
+      <w:pPr>
+        <w:spacing w:after="30"/>
+      </w:pPr>
       <w:r>
         <w:rPr>
           <w:i/>
@@ -1363,9 +1121,40 @@
           <w:sz w:val="19"/>
           <w:szCs w:val="19"/>
         </w:rPr>
-        <w:t>DataStore</w:t>
-      </w:r>
-      <w:proofErr w:type="spellEnd"/>
+        <w:t>React (Vite) · FastAPI · SQLite + FTS5 · httpx · asyncio</w:t>
+      </w:r>
+    </w:p>
+    <w:p>
+      <w:pPr>
+        <w:pStyle w:val="ListParagraph"/>
+        <w:numPr>
+          <w:ilvl w:val="0"/>
+          <w:numId w:val="2"/>
+        </w:numPr>
+        <w:spacing w:after="20"/>
+      </w:pPr>
+      <w:r>
+        <w:t>Unified Groq (Llama 3.3 70B) and Gemini into an AI workspace via parallel fan-out routing, with SQLite + FTS5 context injection.</w:t>
+      </w:r>
+    </w:p>
+    <w:p>
+      <w:pPr>
+        <w:spacing w:before="100" w:after="8"/>
+      </w:pPr>
+      <w:r>
+        <w:rPr>
+          <w:b/>
+          <w:bCs/>
+          <w:sz w:val="21"/>
+          <w:szCs w:val="21"/>
+        </w:rPr>
+        <w:t>Super-NLM — Multi-Account NotebookLM Hub &amp; MCP Server</w:t>
+      </w:r>
+    </w:p>
+    <w:p>
+      <w:pPr>
+        <w:spacing w:after="30"/>
+      </w:pPr>
       <w:r>
         <w:rPr>
           <w:i/>
@@ -1374,137 +1163,20 @@
           <w:sz w:val="19"/>
           <w:szCs w:val="19"/>
         </w:rPr>
-        <w:t xml:space="preserve"> · Apache POI</w:t>
-      </w:r>
-    </w:p>
-    <w:p>
-      <w:pPr>
-        <w:pStyle w:val="ListParagraph"/>
-        <w:numPr>
-          <w:ilvl w:val="0"/>
-          <w:numId w:val="2"/>
-        </w:numPr>
-        <w:spacing w:after="40"/>
-      </w:pPr>
-      <w:r>
-        <w:t xml:space="preserve">Assembled a modular Android super-app (SDK 36) with gesture control, an </w:t>
-      </w:r>
-      <w:proofErr w:type="spellStart"/>
-      <w:r>
-        <w:t>eSewa</w:t>
-      </w:r>
-      <w:proofErr w:type="spellEnd"/>
-      <w:r>
-        <w:t xml:space="preserve"> Gmail budget tracker, and a Material3 design system.</w:t>
-      </w:r>
-    </w:p>
-    <w:p>
-      <w:pPr>
-        <w:spacing w:before="140" w:after="10"/>
-      </w:pPr>
-      <w:r>
-        <w:rPr>
-          <w:b/>
-          <w:bCs/>
-          <w:sz w:val="21"/>
-          <w:szCs w:val="21"/>
-        </w:rPr>
-        <w:t>Nexus — Personal AI Operating System</w:t>
-      </w:r>
-    </w:p>
-    <w:p>
-      <w:pPr>
-        <w:spacing w:after="50"/>
-      </w:pPr>
-      <w:r>
-        <w:rPr>
-          <w:i/>
-          <w:iCs/>
-          <w:color w:val="333333"/>
-          <w:sz w:val="19"/>
-          <w:szCs w:val="19"/>
-        </w:rPr>
-        <w:t>React (</w:t>
-      </w:r>
-      <w:proofErr w:type="spellStart"/>
-      <w:r>
-        <w:rPr>
-          <w:i/>
-          <w:iCs/>
-          <w:color w:val="333333"/>
-          <w:sz w:val="19"/>
-          <w:szCs w:val="19"/>
-        </w:rPr>
-        <w:t>Vite</w:t>
-      </w:r>
-      <w:proofErr w:type="spellEnd"/>
-      <w:r>
-        <w:rPr>
-          <w:i/>
-          <w:iCs/>
-          <w:color w:val="333333"/>
-          <w:sz w:val="19"/>
-          <w:szCs w:val="19"/>
-        </w:rPr>
-        <w:t xml:space="preserve">) · FastAPI · SQLite + FTS5 · </w:t>
-      </w:r>
-      <w:proofErr w:type="spellStart"/>
-      <w:r>
-        <w:rPr>
-          <w:i/>
-          <w:iCs/>
-          <w:color w:val="333333"/>
-          <w:sz w:val="19"/>
-          <w:szCs w:val="19"/>
-        </w:rPr>
-        <w:t>httpx</w:t>
-      </w:r>
-      <w:proofErr w:type="spellEnd"/>
-      <w:r>
-        <w:rPr>
-          <w:i/>
-          <w:iCs/>
-          <w:color w:val="333333"/>
-          <w:sz w:val="19"/>
-          <w:szCs w:val="19"/>
-        </w:rPr>
-        <w:t xml:space="preserve"> · </w:t>
-      </w:r>
-      <w:proofErr w:type="spellStart"/>
-      <w:r>
-        <w:rPr>
-          <w:i/>
-          <w:iCs/>
-          <w:color w:val="333333"/>
-          <w:sz w:val="19"/>
-          <w:szCs w:val="19"/>
-        </w:rPr>
-        <w:t>asyncio</w:t>
-      </w:r>
-      <w:proofErr w:type="spellEnd"/>
-    </w:p>
-    <w:p>
-      <w:pPr>
-        <w:pStyle w:val="ListParagraph"/>
-        <w:numPr>
-          <w:ilvl w:val="0"/>
-          <w:numId w:val="2"/>
-        </w:numPr>
-        <w:spacing w:after="40"/>
-      </w:pPr>
-      <w:r>
-        <w:t xml:space="preserve">Unified </w:t>
-      </w:r>
-      <w:proofErr w:type="spellStart"/>
-      <w:r>
-        <w:t>Groq</w:t>
-      </w:r>
-      <w:proofErr w:type="spellEnd"/>
-      <w:r>
-        <w:t xml:space="preserve"> (Llama 3.3 70B) an</w:t>
-      </w:r>
-      <w:r>
-        <w:t>d Gemini into an AI workspace via parallel fan-out routing, with SQLite + FTS5 context injection.</w:t>
+        <w:t>Python · MCP · NotebookLM · FastAPI · Round-Robin Rate-Limit Routing</w:t>
+      </w:r>
+    </w:p>
+    <w:p>
+      <w:pPr>
+        <w:pStyle w:val="ListParagraph"/>
+        <w:numPr>
+          <w:ilvl w:val="0"/>
+          <w:numId w:val="2"/>
+        </w:numPr>
+        <w:spacing w:after="20"/>
+      </w:pPr>
+      <w:r>
+        <w:t>Built an MCP-enabled dashboard for parallel NotebookLM access across N Google accounts, with round-robin account routing and quota cooldown.</w:t>
       </w:r>
     </w:p>
     <w:p>
@@ -1512,7 +1184,7 @@
         <w:pBdr>
           <w:bottom w:val="single" w:sz="6" w:space="2" w:color="1F3864"/>
         </w:pBdr>
-        <w:spacing w:before="260" w:after="100"/>
+        <w:spacing w:before="180" w:after="70"/>
       </w:pPr>
       <w:r>
         <w:rPr>
@@ -1528,7 +1200,7 @@
     </w:p>
     <w:p>
       <w:pPr>
-        <w:spacing w:after="50"/>
+        <w:spacing w:after="30"/>
       </w:pPr>
       <w:r>
         <w:rPr>
@@ -1538,210 +1210,72 @@
         <w:t xml:space="preserve">Programming: </w:t>
       </w:r>
       <w:r>
-        <w:t>Python, C, C++, Kotlin, SQL (PostgreSQL / SQLite), VHDL</w:t>
-      </w:r>
-    </w:p>
-    <w:p>
-      <w:pPr>
-        <w:spacing w:after="50"/>
-      </w:pPr>
-      <w:r>
-        <w:rPr>
-          <w:b/>
-          <w:bCs/>
-        </w:rPr>
-        <w:t xml:space="preserve">Machine Learning: </w:t>
-      </w:r>
-      <w:r>
-        <w:t xml:space="preserve">scikit-learn, NumPy, Pandas, </w:t>
-      </w:r>
-      <w:proofErr w:type="spellStart"/>
-      <w:r>
-        <w:t>XGBoost</w:t>
-      </w:r>
-      <w:proofErr w:type="spellEnd"/>
-      <w:r>
-        <w:t>, Random Forest, Logistic/Ri</w:t>
-      </w:r>
-      <w:r>
-        <w:t xml:space="preserve">dge/SGD Classifiers, Lasso, </w:t>
-      </w:r>
-      <w:proofErr w:type="spellStart"/>
-      <w:r>
-        <w:t>ElasticNet</w:t>
-      </w:r>
-      <w:proofErr w:type="spellEnd"/>
-      <w:r>
-        <w:t>, SMOTE (</w:t>
-      </w:r>
-      <w:proofErr w:type="spellStart"/>
-      <w:r>
-        <w:t>ImbPipeline</w:t>
-      </w:r>
-      <w:proofErr w:type="spellEnd"/>
-      <w:r>
-        <w:t xml:space="preserve">), SHAP, </w:t>
-      </w:r>
-      <w:proofErr w:type="spellStart"/>
-      <w:r>
-        <w:t>GridSearchCV</w:t>
-      </w:r>
-      <w:proofErr w:type="spellEnd"/>
-      <w:r>
-        <w:t xml:space="preserve">, Stratified K-Fold CV, Joblib, </w:t>
-      </w:r>
-      <w:proofErr w:type="spellStart"/>
-      <w:r>
-        <w:t>PyMC</w:t>
-      </w:r>
-      <w:proofErr w:type="spellEnd"/>
-      <w:r>
-        <w:t xml:space="preserve">, </w:t>
-      </w:r>
-      <w:proofErr w:type="spellStart"/>
-      <w:r>
-        <w:t>ArviZ</w:t>
-      </w:r>
-      <w:proofErr w:type="spellEnd"/>
-      <w:r>
-        <w:t xml:space="preserve">, </w:t>
-      </w:r>
-      <w:proofErr w:type="spellStart"/>
-      <w:r>
-        <w:t>pgmpy</w:t>
-      </w:r>
-      <w:proofErr w:type="spellEnd"/>
-      <w:r>
-        <w:t>, Bayesian Inference, Gaussian Process Regression, K-Means, Hierarchical Clustering, DBSCAN, Time Series Forecasting (SARIMA, H</w:t>
-      </w:r>
-      <w:r>
-        <w:t xml:space="preserve">olt-Winters, Prophet, </w:t>
-      </w:r>
-      <w:proofErr w:type="spellStart"/>
-      <w:r>
-        <w:t>LightGBM</w:t>
-      </w:r>
-      <w:proofErr w:type="spellEnd"/>
-      <w:r>
-        <w:t>, LSTM)</w:t>
-      </w:r>
-    </w:p>
-    <w:p>
-      <w:pPr>
-        <w:spacing w:after="50"/>
-      </w:pPr>
-      <w:r>
-        <w:rPr>
-          <w:b/>
-          <w:bCs/>
-        </w:rPr>
-        <w:t xml:space="preserve">Android Development: </w:t>
-      </w:r>
-      <w:r>
-        <w:t xml:space="preserve">Kotlin, Jetpack Compose, Material3, </w:t>
-      </w:r>
-      <w:proofErr w:type="spellStart"/>
-      <w:r>
-        <w:t>DataStore</w:t>
-      </w:r>
-      <w:proofErr w:type="spellEnd"/>
-      <w:r>
-        <w:t xml:space="preserve">, </w:t>
-      </w:r>
-      <w:proofErr w:type="spellStart"/>
-      <w:r>
-        <w:t>CameraX</w:t>
-      </w:r>
-      <w:proofErr w:type="spellEnd"/>
-      <w:r>
-        <w:t>, MediaPipe, Apache POI</w:t>
-      </w:r>
-    </w:p>
-    <w:p>
-      <w:pPr>
-        <w:spacing w:after="50"/>
-      </w:pPr>
-      <w:r>
-        <w:rPr>
-          <w:b/>
-          <w:bCs/>
-        </w:rPr>
-        <w:t xml:space="preserve">Deployment: </w:t>
-      </w:r>
-      <w:r>
-        <w:t xml:space="preserve">FastAPI, REST APIs, Docker, PostgreSQL, </w:t>
-      </w:r>
-      <w:proofErr w:type="spellStart"/>
-      <w:r>
-        <w:t>Streamlit</w:t>
-      </w:r>
-      <w:proofErr w:type="spellEnd"/>
-      <w:r>
-        <w:t xml:space="preserve">, </w:t>
-      </w:r>
-      <w:proofErr w:type="spellStart"/>
-      <w:r>
-        <w:t>asyncio</w:t>
-      </w:r>
-      <w:proofErr w:type="spellEnd"/>
-      <w:r>
-        <w:t>, Joblib</w:t>
-      </w:r>
-    </w:p>
-    <w:p>
-      <w:pPr>
-        <w:spacing w:after="50"/>
-      </w:pPr>
-      <w:r>
-        <w:rPr>
-          <w:b/>
-          <w:bCs/>
-        </w:rPr>
-        <w:t xml:space="preserve">Embedded Systems: </w:t>
-      </w:r>
-      <w:r>
-        <w:t>Arduino, ESP32-S3, MPU</w:t>
-      </w:r>
-      <w:r>
-        <w:t xml:space="preserve">6050, Stepper Motors, HC-05 BT, UART, MQTT, FPGA, </w:t>
-      </w:r>
-      <w:proofErr w:type="spellStart"/>
-      <w:r>
-        <w:t>Vivado</w:t>
-      </w:r>
-      <w:proofErr w:type="spellEnd"/>
-    </w:p>
-    <w:p>
-      <w:pPr>
-        <w:spacing w:after="50"/>
-      </w:pPr>
-      <w:r>
-        <w:rPr>
-          <w:b/>
-          <w:bCs/>
-        </w:rPr>
-        <w:t xml:space="preserve">AI / Local LLM: </w:t>
-      </w:r>
-      <w:proofErr w:type="spellStart"/>
-      <w:r>
-        <w:t>Ollama</w:t>
-      </w:r>
-      <w:proofErr w:type="spellEnd"/>
-      <w:r>
-        <w:t xml:space="preserve">, </w:t>
-      </w:r>
-      <w:proofErr w:type="spellStart"/>
-      <w:r>
-        <w:t>AnythingLLM</w:t>
-      </w:r>
-      <w:proofErr w:type="spellEnd"/>
-      <w:r>
-        <w:t>, Prompt Chaining, Agentic Query Systems</w:t>
-      </w:r>
-    </w:p>
-    <w:p>
-      <w:pPr>
-        <w:spacing w:after="50"/>
+        <w:t>Python, C, C++, Kotlin, SQL, VHDL</w:t>
+      </w:r>
+    </w:p>
+    <w:p>
+      <w:pPr>
+        <w:spacing w:after="30"/>
+      </w:pPr>
+      <w:r>
+        <w:rPr>
+          <w:b/>
+          <w:bCs/>
+        </w:rPr>
+        <w:t xml:space="preserve">AI/ML: </w:t>
+      </w:r>
+      <w:r>
+        <w:t>scikit-learn, XGBoost, Random Forest, SHAP, AIF360, Fairlearn, PyMC, ArviZ, pgmpy, clustering, forecasting</w:t>
+      </w:r>
+    </w:p>
+    <w:p>
+      <w:pPr>
+        <w:spacing w:after="30"/>
+      </w:pPr>
+      <w:r>
+        <w:rPr>
+          <w:b/>
+          <w:bCs/>
+        </w:rPr>
+        <w:t xml:space="preserve">AI Systems: </w:t>
+      </w:r>
+      <w:r>
+        <w:t>FastAPI, Docker, PostgreSQL, SQLite/FTS5, REST APIs, asyncio, MCP</w:t>
+      </w:r>
+    </w:p>
+    <w:p>
+      <w:pPr>
+        <w:spacing w:after="30"/>
+      </w:pPr>
+      <w:r>
+        <w:rPr>
+          <w:b/>
+          <w:bCs/>
+        </w:rPr>
+        <w:t xml:space="preserve">Computer Vision/Mobile: </w:t>
+      </w:r>
+      <w:r>
+        <w:t>OpenCV, MediaPipe, CameraX, Kotlin, Jetpack Compose</w:t>
+      </w:r>
+    </w:p>
+    <w:p>
+      <w:pPr>
+        <w:spacing w:after="30"/>
+      </w:pPr>
+      <w:r>
+        <w:rPr>
+          <w:b/>
+          <w:bCs/>
+        </w:rPr>
+        <w:t xml:space="preserve">Embedded/Robotics: </w:t>
+      </w:r>
+      <w:r>
+        <w:t>ESP32-S3, Arduino, MPU6050, Stepper Motors, UART, MQTT, FPGA/Vivado</w:t>
+      </w:r>
+    </w:p>
+    <w:p>
+      <w:pPr>
+        <w:spacing w:after="30"/>
       </w:pPr>
       <w:r>
         <w:rPr>
@@ -1751,33 +1285,7 @@
         <w:t xml:space="preserve">Tools: </w:t>
       </w:r>
       <w:r>
-        <w:t xml:space="preserve">Git, GitHub, VS Code, Jupyter Notebook, Google </w:t>
-      </w:r>
-      <w:proofErr w:type="spellStart"/>
-      <w:r>
-        <w:t>Colab</w:t>
-      </w:r>
-      <w:proofErr w:type="spellEnd"/>
-      <w:r>
-        <w:t>, MATLAB, LaTeX / Overleaf, SSMS</w:t>
-      </w:r>
-    </w:p>
-    <w:p>
-      <w:pPr>
-        <w:spacing w:after="50"/>
-      </w:pPr>
-      <w:r>
-        <w:rPr>
-          <w:b/>
-          <w:bCs/>
-        </w:rPr>
-        <w:t xml:space="preserve">Other: </w:t>
-      </w:r>
-      <w:r>
-        <w:t>Project Coordination, Pu</w:t>
-      </w:r>
-      <w:r>
-        <w:t>blic Relations, Microsoft Office, Canva</w:t>
+        <w:t>Git, GitHub, MATLAB, Jupyter, Colab, LaTeX/Overleaf</w:t>
       </w:r>
     </w:p>
     <w:p>
@@ -1785,7 +1293,7 @@
         <w:pBdr>
           <w:bottom w:val="single" w:sz="6" w:space="2" w:color="1F3864"/>
         </w:pBdr>
-        <w:spacing w:before="260" w:after="100"/>
+        <w:spacing w:before="180" w:after="70"/>
       </w:pPr>
       <w:r>
         <w:rPr>
@@ -1808,78 +1316,7 @@
           <w:sz w:val="19"/>
           <w:szCs w:val="19"/>
         </w:rPr>
-        <w:t xml:space="preserve">IEEE WIE Nepal LaTeX Workshop (May 2026) · IEEE </w:t>
-      </w:r>
-      <w:proofErr w:type="spellStart"/>
-      <w:r>
-        <w:rPr>
-          <w:sz w:val="19"/>
-          <w:szCs w:val="19"/>
-        </w:rPr>
-        <w:t>SPAx</w:t>
-      </w:r>
-      <w:proofErr w:type="spellEnd"/>
-      <w:r>
-        <w:rPr>
-          <w:sz w:val="19"/>
-          <w:szCs w:val="19"/>
-        </w:rPr>
-        <w:t xml:space="preserve"> organizing team · Prompt Engineering Fundamentals, </w:t>
-      </w:r>
-      <w:proofErr w:type="spellStart"/>
-      <w:r>
-        <w:rPr>
-          <w:sz w:val="19"/>
-          <w:szCs w:val="19"/>
-        </w:rPr>
-        <w:t>TechAxis</w:t>
-      </w:r>
-      <w:proofErr w:type="spellEnd"/>
-      <w:r>
-        <w:rPr>
-          <w:sz w:val="19"/>
-          <w:szCs w:val="19"/>
-        </w:rPr>
-        <w:t xml:space="preserve"> · </w:t>
-      </w:r>
-      <w:proofErr w:type="spellStart"/>
-      <w:r>
-        <w:rPr>
-          <w:sz w:val="19"/>
-          <w:szCs w:val="19"/>
-        </w:rPr>
-        <w:t>IEEEXtreme</w:t>
-      </w:r>
-      <w:proofErr w:type="spellEnd"/>
-      <w:r>
-        <w:rPr>
-          <w:sz w:val="19"/>
-          <w:szCs w:val="19"/>
-        </w:rPr>
-        <w:t xml:space="preserve"> 19.0 (Team </w:t>
-      </w:r>
-      <w:proofErr w:type="spellStart"/>
-      <w:r>
-        <w:rPr>
-          <w:sz w:val="19"/>
-          <w:szCs w:val="19"/>
-        </w:rPr>
-        <w:t>ShadowXTREME</w:t>
-      </w:r>
-      <w:proofErr w:type="spellEnd"/>
-      <w:r>
-        <w:rPr>
-          <w:sz w:val="19"/>
-          <w:szCs w:val="19"/>
-        </w:rPr>
-        <w:t xml:space="preserve">) · PCB Design &amp; Fabrication Workshop, </w:t>
-      </w:r>
-      <w:r>
-        <w:rPr>
-          <w:sz w:val="19"/>
-          <w:szCs w:val="19"/>
-        </w:rPr>
-        <w:t>KEC Robotics Club · AWS Cloud Computing Workshop · Microsoft Learn Student Ambassador</w:t>
+        <w:t>IEEE WIE Nepal LaTeX Workshop (May 2026) · IEEE SPAx organizing team · Prompt Engineering Fundamentals, TechAxis · IEEEXtreme 19.0 (Team ShadowXTREME) · PCB Design &amp; Fabrication Workshop, KEC Robotics Club · AWS Cloud Computing Workshop · Microsoft Learn Student Ambassador</w:t>
       </w:r>
     </w:p>
     <w:p>
@@ -1894,13 +1331,8 @@
           <w:sz w:val="18"/>
           <w:szCs w:val="18"/>
         </w:rPr>
-        <w:t>Participate in IEEE KEC KTM Student Branch, Electronics Project Club, KEC Maker’s Space, and KEC Music Club.</w:t>
-      </w:r>
-    </w:p>
-    <w:p>
-      <w:pPr>
-        <w:spacing w:before="100"/>
-      </w:pPr>
+        <w:t xml:space="preserve">Active in IEEE KEC, EPC, KEC Maker’s Space, and KEC Music Club. </w:t>
+      </w:r>
       <w:r>
         <w:rPr>
           <w:i/>
@@ -1909,7 +1341,7 @@
           <w:sz w:val="16"/>
           <w:szCs w:val="16"/>
         </w:rPr>
-        <w:t>Last Updated: August 24, 2026</w:t>
+        <w:t>| Last Updated: August 24, 2026</w:t>
       </w:r>
     </w:p>
     <w:sectPr>

</xml_diff>

<commit_message>
docs(readme): update verify.yml, README.md +28 more - AARADHYA DEV TAMRAKAR (+647/-647)
</commit_message>
<xml_diff>
--- a/assets/docs/AARADHYA_DEV_TAMRAKAR_CV.docx
+++ b/assets/docs/AARADHYA_DEV_TAMRAKAR_CV.docx
@@ -32,9 +32,13 @@
           <w:p>
             <w:pPr>
               <w:spacing w:after="20"/>
+              <w:rPr>
+                <w:rFonts w:cs="Times New Roman"/>
+              </w:rPr>
             </w:pPr>
             <w:r>
               <w:rPr>
+                <w:rFonts w:cs="Times New Roman"/>
                 <w:b/>
                 <w:bCs/>
                 <w:color w:val="1F3864"/>
@@ -47,21 +51,28 @@
           <w:p>
             <w:pPr>
               <w:spacing w:after="20"/>
+              <w:rPr>
+                <w:rFonts w:cs="Times New Roman"/>
+              </w:rPr>
             </w:pPr>
             <w:r>
               <w:rPr>
+                <w:rFonts w:cs="Times New Roman"/>
                 <w:b/>
-                <w:bCs/>
-                <w:color w:val="1F3864"/>
                 <w:sz w:val="19"/>
-                <w:szCs w:val="19"/>
               </w:rPr>
-              <w:t>AI/ML · Edge AI · Intelligent Systems · Robotics</w:t>
+              <w:t>AI/ML · Edge AI · Computer Vision · Formal Methods · Robotics</w:t>
             </w:r>
           </w:p>
           <w:p>
+            <w:pPr>
+              <w:rPr>
+                <w:rFonts w:cs="Times New Roman"/>
+              </w:rPr>
+            </w:pPr>
             <w:r>
               <w:rPr>
+                <w:rFonts w:cs="Times New Roman"/>
                 <w:sz w:val="18"/>
                 <w:szCs w:val="18"/>
               </w:rPr>
@@ -70,6 +81,7 @@
             <w:hyperlink r:id="rId5" w:history="1">
               <w:r>
                 <w:rPr>
+                  <w:rFonts w:cs="Times New Roman"/>
                   <w:color w:val="1F3864"/>
                   <w:sz w:val="18"/>
                   <w:szCs w:val="18"/>
@@ -80,6 +92,7 @@
             </w:hyperlink>
             <w:r>
               <w:rPr>
+                <w:rFonts w:cs="Times New Roman"/>
                 <w:sz w:val="18"/>
                 <w:szCs w:val="18"/>
               </w:rPr>
@@ -88,6 +101,7 @@
             <w:hyperlink r:id="rId6" w:history="1">
               <w:r>
                 <w:rPr>
+                  <w:rFonts w:cs="Times New Roman"/>
                   <w:color w:val="1F3864"/>
                   <w:sz w:val="18"/>
                   <w:szCs w:val="18"/>
@@ -98,6 +112,7 @@
             </w:hyperlink>
             <w:r>
               <w:rPr>
+                <w:rFonts w:cs="Times New Roman"/>
                 <w:sz w:val="18"/>
                 <w:szCs w:val="18"/>
               </w:rPr>
@@ -106,6 +121,7 @@
             <w:hyperlink r:id="rId7" w:history="1">
               <w:r>
                 <w:rPr>
+                  <w:rFonts w:cs="Times New Roman"/>
                   <w:color w:val="1F3864"/>
                   <w:sz w:val="18"/>
                   <w:szCs w:val="18"/>
@@ -114,6 +130,8 @@
                 <w:t>aaradhyadt.github.io</w:t>
               </w:r>
             </w:hyperlink>
+            <w:bookmarkStart w:id="0" w:name="_GoBack"/>
+            <w:bookmarkEnd w:id="0"/>
           </w:p>
         </w:tc>
         <w:tc>
@@ -124,50 +142,10 @@
           <w:p>
             <w:pPr>
               <w:jc w:val="right"/>
+              <w:rPr>
+                <w:rFonts w:cs="Times New Roman"/>
+              </w:rPr>
             </w:pPr>
-            <w:r>
-              <w:rPr>
-                <w:noProof/>
-              </w:rPr>
-              <w:drawing>
-                <wp:inline distT="0" distB="0" distL="0" distR="0" wp14:anchorId="638DF803" wp14:editId="587072A4">
-                  <wp:extent cx="666750" cy="666750"/>
-                  <wp:effectExtent l="0" t="0" r="0" b="0"/>
-                  <wp:docPr id="1" name="Picture 1"/>
-                  <wp:cNvGraphicFramePr>
-                    <a:graphicFrameLocks xmlns:a="http://schemas.openxmlformats.org/drawingml/2006/main" noChangeAspect="1"/>
-                  </wp:cNvGraphicFramePr>
-                  <a:graphic xmlns:a="http://schemas.openxmlformats.org/drawingml/2006/main">
-                    <a:graphicData uri="http://schemas.openxmlformats.org/drawingml/2006/picture">
-                      <pic:pic xmlns:pic="http://schemas.openxmlformats.org/drawingml/2006/picture">
-                        <pic:nvPicPr>
-                          <pic:cNvPr id="0" name=""/>
-                          <pic:cNvPicPr>
-                            <a:picLocks noChangeAspect="1" noChangeArrowheads="1"/>
-                          </pic:cNvPicPr>
-                        </pic:nvPicPr>
-                        <pic:blipFill>
-                          <a:blip r:embed="rId8"/>
-                          <a:srcRect/>
-                          <a:stretch>
-                            <a:fillRect/>
-                          </a:stretch>
-                        </pic:blipFill>
-                        <pic:spPr bwMode="auto">
-                          <a:xfrm>
-                            <a:off x="0" y="0"/>
-                            <a:ext cx="666750" cy="666750"/>
-                          </a:xfrm>
-                          <a:prstGeom prst="rect">
-                            <a:avLst/>
-                          </a:prstGeom>
-                        </pic:spPr>
-                      </pic:pic>
-                    </a:graphicData>
-                  </a:graphic>
-                </wp:inline>
-              </w:drawing>
-            </w:r>
           </w:p>
         </w:tc>
       </w:tr>
@@ -175,6 +153,9 @@
     <w:p>
       <w:pPr>
         <w:spacing w:after="100"/>
+        <w:rPr>
+          <w:rFonts w:cs="Times New Roman"/>
+        </w:rPr>
       </w:pPr>
     </w:p>
     <w:p>
@@ -183,9 +164,13 @@
           <w:bottom w:val="single" w:sz="6" w:space="2" w:color="1F3864"/>
         </w:pBdr>
         <w:spacing w:before="180" w:after="70"/>
-      </w:pPr>
-      <w:r>
-        <w:rPr>
+        <w:rPr>
+          <w:rFonts w:cs="Times New Roman"/>
+        </w:rPr>
+      </w:pPr>
+      <w:r>
+        <w:rPr>
+          <w:rFonts w:cs="Times New Roman"/>
           <w:b/>
           <w:bCs/>
           <w:color w:val="1F3864"/>
@@ -199,9 +184,15 @@
     <w:p>
       <w:pPr>
         <w:spacing w:after="120"/>
-      </w:pPr>
-      <w:r>
-        <w:t>Electronics, Communication and Information Engineering student at IOE, Kathmandu Engineering College, focused on AI/ML, edge AI, responsible AI, and intelligent systems. Builds end-to-end machine learning systems spanning model development, statistical evaluation, explainability, APIs, and deployment, with hands-on experience in ESP32-S3, computer vision, embedded control, and robotics. Currently developing BiasAperture, a fairness-auditing framework for facial-analysis systems, and SPARK, an ESP32-S3 edge-AI wearable fall-detection system.</w:t>
+        <w:rPr>
+          <w:rFonts w:cs="Times New Roman"/>
+        </w:rPr>
+      </w:pPr>
+      <w:r>
+        <w:rPr>
+          <w:rFonts w:cs="Times New Roman"/>
+        </w:rPr>
+        <w:t>Final-year Electronics, Communication and Information Engineering student at IOE, Kathmandu Engineering College, focused on applied ML, edge AI, computer vision, statistical evaluation, and formal verification. Builds reproducible end-to-end systems spanning model training, quantitative evaluation, explainability, APIs, embedded inference, and SMT-based verification. Current work includes BiasAperture, SPARK, and a Headless Invariant Assurance Engine for state-machine verification and counterexample replay.</w:t>
       </w:r>
     </w:p>
     <w:p>
@@ -210,9 +201,13 @@
           <w:bottom w:val="single" w:sz="6" w:space="2" w:color="1F3864"/>
         </w:pBdr>
         <w:spacing w:before="180" w:after="70"/>
-      </w:pPr>
-      <w:r>
-        <w:rPr>
+        <w:rPr>
+          <w:rFonts w:cs="Times New Roman"/>
+        </w:rPr>
+      </w:pPr>
+      <w:r>
+        <w:rPr>
+          <w:rFonts w:cs="Times New Roman"/>
           <w:b/>
           <w:bCs/>
           <w:color w:val="1F3864"/>
@@ -229,66 +224,81 @@
           <w:tab w:val="right" w:pos="10080"/>
         </w:tabs>
         <w:spacing w:before="120" w:after="15"/>
-      </w:pPr>
-      <w:r>
-        <w:rPr>
+        <w:rPr>
+          <w:rFonts w:cs="Times New Roman"/>
+        </w:rPr>
+      </w:pPr>
+      <w:r>
+        <w:rPr>
+          <w:rFonts w:cs="Times New Roman"/>
+          <w:b/>
+        </w:rPr>
+        <w:t>Bachelor of Engineering (B.E.)</w:t>
+      </w:r>
+      <w:r>
+        <w:rPr>
+          <w:rFonts w:cs="Times New Roman"/>
+          <w:i/>
+        </w:rPr>
+        <w:tab/>
+        <w:t>Expected: January 2027</w:t>
+      </w:r>
+    </w:p>
+    <w:p>
+      <w:pPr>
+        <w:spacing w:after="15"/>
+        <w:rPr>
+          <w:rFonts w:cs="Times New Roman"/>
+        </w:rPr>
+      </w:pPr>
+      <w:r>
+        <w:rPr>
+          <w:rFonts w:cs="Times New Roman"/>
+        </w:rPr>
+        <w:t>Electronics, Communication and Information Engineering — Tribhuvan University, Institute of Engineering (IOE), Kathmandu Engineering College | Year IV / Part II</w:t>
+      </w:r>
+    </w:p>
+    <w:p>
+      <w:pPr>
+        <w:spacing w:after="100"/>
+        <w:rPr>
+          <w:rFonts w:cs="Times New Roman"/>
+        </w:rPr>
+      </w:pPr>
+      <w:r>
+        <w:rPr>
+          <w:rFonts w:cs="Times New Roman"/>
           <w:b/>
           <w:bCs/>
-          <w:sz w:val="21"/>
-          <w:szCs w:val="21"/>
-        </w:rPr>
-        <w:t>Bachelor of Engineering (B.E.)</w:t>
-      </w:r>
-      <w:r>
-        <w:rPr>
-          <w:i/>
-          <w:iCs/>
-          <w:color w:val="333333"/>
-        </w:rPr>
-        <w:tab/>
-        <w:t>Expected: January 2027</w:t>
-      </w:r>
-    </w:p>
-    <w:p>
-      <w:pPr>
-        <w:spacing w:after="15"/>
-      </w:pPr>
-      <w:r>
-        <w:rPr>
-          <w:i/>
-          <w:iCs/>
-          <w:color w:val="333333"/>
-        </w:rPr>
-        <w:t>Electronics, Communication and Information — Institute of Engineering (IOE), Kathmandu Engineering College | Year IV / Part II</w:t>
-      </w:r>
-    </w:p>
-    <w:p>
-      <w:pPr>
-        <w:spacing w:after="100"/>
-      </w:pPr>
-      <w:r>
-        <w:rPr>
+        </w:rPr>
+        <w:t xml:space="preserve">Coursework: </w:t>
+      </w:r>
+      <w:r>
+        <w:rPr>
+          <w:rFonts w:cs="Times New Roman"/>
+        </w:rPr>
+        <w:t>Machine Learning · Signals and Systems · Digital Electronics · Control Systems · Communication Systems</w:t>
+      </w:r>
+    </w:p>
+    <w:p>
+      <w:pPr>
+        <w:spacing w:after="120"/>
+        <w:rPr>
+          <w:rFonts w:cs="Times New Roman"/>
+        </w:rPr>
+      </w:pPr>
+      <w:r>
+        <w:rPr>
+          <w:rFonts w:cs="Times New Roman"/>
           <w:b/>
           <w:bCs/>
         </w:rPr>
-        <w:t xml:space="preserve">Coursework: </w:t>
-      </w:r>
-      <w:r>
-        <w:t>Machine Learning · Signals and Systems · Digital Electronics · Control Systems · Communication Systems</w:t>
-      </w:r>
-    </w:p>
-    <w:p>
-      <w:pPr>
-        <w:spacing w:after="120"/>
-      </w:pPr>
-      <w:r>
-        <w:rPr>
-          <w:b/>
-          <w:bCs/>
-        </w:rPr>
         <w:t xml:space="preserve">Cumulative Percentage: </w:t>
       </w:r>
       <w:r>
+        <w:rPr>
+          <w:rFonts w:cs="Times New Roman"/>
+        </w:rPr>
         <w:t>75%</w:t>
       </w:r>
     </w:p>
@@ -298,9 +308,13 @@
           <w:bottom w:val="single" w:sz="6" w:space="2" w:color="1F3864"/>
         </w:pBdr>
         <w:spacing w:before="180" w:after="70"/>
-      </w:pPr>
-      <w:r>
-        <w:rPr>
+        <w:rPr>
+          <w:rFonts w:cs="Times New Roman"/>
+        </w:rPr>
+      </w:pPr>
+      <w:r>
+        <w:rPr>
+          <w:rFonts w:cs="Times New Roman"/>
           <w:b/>
           <w:bCs/>
           <w:color w:val="1F3864"/>
@@ -317,9 +331,13 @@
           <w:tab w:val="right" w:pos="10080"/>
         </w:tabs>
         <w:spacing w:before="120" w:after="15"/>
-      </w:pPr>
-      <w:r>
-        <w:rPr>
+        <w:rPr>
+          <w:rFonts w:cs="Times New Roman"/>
+        </w:rPr>
+      </w:pPr>
+      <w:r>
+        <w:rPr>
+          <w:rFonts w:cs="Times New Roman"/>
           <w:b/>
           <w:bCs/>
           <w:sz w:val="21"/>
@@ -329,6 +347,7 @@
       </w:r>
       <w:r>
         <w:rPr>
+          <w:rFonts w:cs="Times New Roman"/>
           <w:i/>
           <w:iCs/>
           <w:color w:val="333333"/>
@@ -340,9 +359,13 @@
     <w:p>
       <w:pPr>
         <w:spacing w:after="15"/>
-      </w:pPr>
-      <w:r>
-        <w:rPr>
+        <w:rPr>
+          <w:rFonts w:cs="Times New Roman"/>
+        </w:rPr>
+      </w:pPr>
+      <w:r>
+        <w:rPr>
+          <w:rFonts w:cs="Times New Roman"/>
           <w:i/>
           <w:iCs/>
           <w:color w:val="333333"/>
@@ -382,9 +405,13 @@
           <w:tab w:val="right" w:pos="10080"/>
         </w:tabs>
         <w:spacing w:before="120" w:after="15"/>
-      </w:pPr>
-      <w:r>
-        <w:rPr>
+        <w:rPr>
+          <w:rFonts w:cs="Times New Roman"/>
+        </w:rPr>
+      </w:pPr>
+      <w:r>
+        <w:rPr>
+          <w:rFonts w:cs="Times New Roman"/>
           <w:b/>
           <w:bCs/>
           <w:sz w:val="21"/>
@@ -394,6 +421,7 @@
       </w:r>
       <w:r>
         <w:rPr>
+          <w:rFonts w:cs="Times New Roman"/>
           <w:i/>
           <w:iCs/>
           <w:color w:val="333333"/>
@@ -405,9 +433,13 @@
     <w:p>
       <w:pPr>
         <w:spacing w:after="15"/>
-      </w:pPr>
-      <w:r>
-        <w:rPr>
+        <w:rPr>
+          <w:rFonts w:cs="Times New Roman"/>
+        </w:rPr>
+      </w:pPr>
+      <w:r>
+        <w:rPr>
+          <w:rFonts w:cs="Times New Roman"/>
           <w:i/>
           <w:iCs/>
           <w:color w:val="333333"/>
@@ -434,9 +466,13 @@
           <w:tab w:val="right" w:pos="10080"/>
         </w:tabs>
         <w:spacing w:before="120" w:after="15"/>
-      </w:pPr>
-      <w:r>
-        <w:rPr>
+        <w:rPr>
+          <w:rFonts w:cs="Times New Roman"/>
+        </w:rPr>
+      </w:pPr>
+      <w:r>
+        <w:rPr>
+          <w:rFonts w:cs="Times New Roman"/>
           <w:b/>
           <w:bCs/>
           <w:sz w:val="21"/>
@@ -446,6 +482,7 @@
       </w:r>
       <w:r>
         <w:rPr>
+          <w:rFonts w:cs="Times New Roman"/>
           <w:i/>
           <w:iCs/>
           <w:color w:val="333333"/>
@@ -457,9 +494,13 @@
     <w:p>
       <w:pPr>
         <w:spacing w:after="15"/>
-      </w:pPr>
-      <w:r>
-        <w:rPr>
+        <w:rPr>
+          <w:rFonts w:cs="Times New Roman"/>
+        </w:rPr>
+      </w:pPr>
+      <w:r>
+        <w:rPr>
+          <w:rFonts w:cs="Times New Roman"/>
           <w:i/>
           <w:iCs/>
           <w:color w:val="333333"/>
@@ -486,9 +527,13 @@
           <w:tab w:val="right" w:pos="10080"/>
         </w:tabs>
         <w:spacing w:before="120" w:after="15"/>
-      </w:pPr>
-      <w:r>
-        <w:rPr>
+        <w:rPr>
+          <w:rFonts w:cs="Times New Roman"/>
+        </w:rPr>
+      </w:pPr>
+      <w:r>
+        <w:rPr>
+          <w:rFonts w:cs="Times New Roman"/>
           <w:b/>
           <w:bCs/>
           <w:sz w:val="21"/>
@@ -498,6 +543,7 @@
       </w:r>
       <w:r>
         <w:rPr>
+          <w:rFonts w:cs="Times New Roman"/>
           <w:i/>
           <w:iCs/>
           <w:color w:val="333333"/>
@@ -509,9 +555,13 @@
     <w:p>
       <w:pPr>
         <w:spacing w:after="15"/>
-      </w:pPr>
-      <w:r>
-        <w:rPr>
+        <w:rPr>
+          <w:rFonts w:cs="Times New Roman"/>
+        </w:rPr>
+      </w:pPr>
+      <w:r>
+        <w:rPr>
+          <w:rFonts w:cs="Times New Roman"/>
           <w:i/>
           <w:iCs/>
           <w:color w:val="333333"/>
@@ -551,9 +601,13 @@
           <w:tab w:val="right" w:pos="10080"/>
         </w:tabs>
         <w:spacing w:before="120" w:after="15"/>
-      </w:pPr>
-      <w:r>
-        <w:rPr>
+        <w:rPr>
+          <w:rFonts w:cs="Times New Roman"/>
+        </w:rPr>
+      </w:pPr>
+      <w:r>
+        <w:rPr>
+          <w:rFonts w:cs="Times New Roman"/>
           <w:b/>
           <w:bCs/>
           <w:sz w:val="21"/>
@@ -563,6 +617,7 @@
       </w:r>
       <w:r>
         <w:rPr>
+          <w:rFonts w:cs="Times New Roman"/>
           <w:i/>
           <w:iCs/>
           <w:color w:val="333333"/>
@@ -574,9 +629,13 @@
     <w:p>
       <w:pPr>
         <w:spacing w:after="15"/>
-      </w:pPr>
-      <w:r>
-        <w:rPr>
+        <w:rPr>
+          <w:rFonts w:cs="Times New Roman"/>
+        </w:rPr>
+      </w:pPr>
+      <w:r>
+        <w:rPr>
+          <w:rFonts w:cs="Times New Roman"/>
           <w:i/>
           <w:iCs/>
           <w:color w:val="333333"/>
@@ -603,9 +662,13 @@
           <w:bottom w:val="single" w:sz="6" w:space="2" w:color="1F3864"/>
         </w:pBdr>
         <w:spacing w:before="180" w:after="70"/>
-      </w:pPr>
-      <w:r>
-        <w:rPr>
+        <w:rPr>
+          <w:rFonts w:cs="Times New Roman"/>
+        </w:rPr>
+      </w:pPr>
+      <w:r>
+        <w:rPr>
+          <w:rFonts w:cs="Times New Roman"/>
           <w:b/>
           <w:bCs/>
           <w:color w:val="1F3864"/>
@@ -622,140 +685,153 @@
           <w:tab w:val="right" w:pos="10080"/>
         </w:tabs>
         <w:spacing w:before="120" w:after="15"/>
-      </w:pPr>
-      <w:r>
-        <w:rPr>
+        <w:rPr>
+          <w:rFonts w:cs="Times New Roman"/>
+        </w:rPr>
+      </w:pPr>
+      <w:r>
+        <w:rPr>
+          <w:rFonts w:cs="Times New Roman"/>
+          <w:b/>
+        </w:rPr>
+        <w:t>Fuse AI Fellow — Fusemachines AI Fellowship 2026</w:t>
+      </w:r>
+      <w:r>
+        <w:rPr>
+          <w:rFonts w:cs="Times New Roman"/>
+          <w:i/>
+        </w:rPr>
+        <w:tab/>
+        <w:t>2026 – Present</w:t>
+      </w:r>
+    </w:p>
+    <w:p>
+      <w:pPr>
+        <w:spacing w:after="15"/>
+        <w:rPr>
+          <w:rFonts w:cs="Times New Roman"/>
+        </w:rPr>
+      </w:pPr>
+      <w:r>
+        <w:rPr>
+          <w:rFonts w:cs="Times New Roman"/>
+          <w:i/>
+          <w:iCs/>
+          <w:color w:val="333333"/>
+        </w:rPr>
+        <w:t>Fusemachines</w:t>
+      </w:r>
+    </w:p>
+    <w:p>
+      <w:pPr>
+        <w:pStyle w:val="ListParagraph"/>
+        <w:numPr>
+          <w:ilvl w:val="0"/>
+          <w:numId w:val="2"/>
+        </w:numPr>
+        <w:spacing w:after="20"/>
+      </w:pPr>
+      <w:r>
+        <w:t>Engineered a five-stage agentic Text-to-SQL pipeline (Planner → Generator → Validator → Executor → Summarizer), achieving 100% execution success and accuracy on a 50-question benchmark.</w:t>
+      </w:r>
+    </w:p>
+    <w:p>
+      <w:pPr>
+        <w:pStyle w:val="ListParagraph"/>
+        <w:numPr>
+          <w:ilvl w:val="0"/>
+          <w:numId w:val="2"/>
+        </w:numPr>
+        <w:spacing w:after="20"/>
+      </w:pPr>
+      <w:r>
+        <w:t>Built containerized AI services using FastAPI, PostgreSQL, and Docker.</w:t>
+      </w:r>
+    </w:p>
+    <w:p>
+      <w:pPr>
+        <w:pStyle w:val="ListParagraph"/>
+        <w:numPr>
+          <w:ilvl w:val="0"/>
+          <w:numId w:val="2"/>
+        </w:numPr>
+        <w:spacing w:after="20"/>
+      </w:pPr>
+      <w:r>
+        <w:t>Developed a churn/CLV pipeline achieving 5-fold CV ROC-AUC 0.841, with threshold tuning and SHAP explainability.</w:t>
+      </w:r>
+    </w:p>
+    <w:p>
+      <w:pPr>
+        <w:pStyle w:val="ListParagraph"/>
+        <w:numPr>
+          <w:ilvl w:val="0"/>
+          <w:numId w:val="2"/>
+        </w:numPr>
+        <w:spacing w:after="20"/>
+      </w:pPr>
+      <w:r>
+        <w:t>Applied Random Forest, XGBoost, Bayesian inference, Gaussian processes, clustering, and forecasting across applied datasets.</w:t>
+      </w:r>
+    </w:p>
+    <w:p>
+      <w:pPr>
+        <w:pStyle w:val="ListParagraph"/>
+        <w:numPr>
+          <w:ilvl w:val="0"/>
+          <w:numId w:val="2"/>
+        </w:numPr>
+        <w:spacing w:after="20"/>
+      </w:pPr>
+      <w:r>
+        <w:t>Worked with UCI Online Retail II (~500K transactions) for segmentation and forecasting, achieving MASE 2.44 with a four-model ensemble.</w:t>
+      </w:r>
+    </w:p>
+    <w:p>
+      <w:pPr>
+        <w:tabs>
+          <w:tab w:val="right" w:pos="10080"/>
+        </w:tabs>
+        <w:spacing w:before="120" w:after="15"/>
+        <w:rPr>
+          <w:rFonts w:cs="Times New Roman"/>
+        </w:rPr>
+      </w:pPr>
+      <w:r>
+        <w:rPr>
+          <w:rFonts w:cs="Times New Roman"/>
           <w:b/>
           <w:bCs/>
           <w:sz w:val="21"/>
           <w:szCs w:val="21"/>
         </w:rPr>
-        <w:t>Fuse AI Fellow — Fusemachines AI Fellowship 2026</w:t>
-      </w:r>
-      <w:r>
-        <w:rPr>
+        <w:t>NSSR DataCamp Fellow — Cohort 2</w:t>
+      </w:r>
+      <w:r>
+        <w:rPr>
+          <w:rFonts w:cs="Times New Roman"/>
           <w:i/>
           <w:iCs/>
           <w:color w:val="333333"/>
         </w:rPr>
         <w:tab/>
-        <w:t>Active</w:t>
+        <w:t>2026 – Present</w:t>
       </w:r>
     </w:p>
     <w:p>
       <w:pPr>
         <w:spacing w:after="15"/>
-      </w:pPr>
-      <w:r>
-        <w:rPr>
+        <w:rPr>
+          <w:rFonts w:cs="Times New Roman"/>
+        </w:rPr>
+      </w:pPr>
+      <w:r>
+        <w:rPr>
+          <w:rFonts w:cs="Times New Roman"/>
           <w:i/>
           <w:iCs/>
           <w:color w:val="333333"/>
         </w:rPr>
-        <w:t>Fusemachines</w:t>
-      </w:r>
-    </w:p>
-    <w:p>
-      <w:pPr>
-        <w:pStyle w:val="ListParagraph"/>
-        <w:numPr>
-          <w:ilvl w:val="0"/>
-          <w:numId w:val="2"/>
-        </w:numPr>
-        <w:spacing w:after="20"/>
-      </w:pPr>
-      <w:r>
-        <w:t>Engineered a five-stage agentic Text-to-SQL pipeline (Planner → Generator → Validator → Executor → Summarizer), achieving 100% execution success and accuracy on a 50-question benchmark.</w:t>
-      </w:r>
-    </w:p>
-    <w:p>
-      <w:pPr>
-        <w:pStyle w:val="ListParagraph"/>
-        <w:numPr>
-          <w:ilvl w:val="0"/>
-          <w:numId w:val="2"/>
-        </w:numPr>
-        <w:spacing w:after="20"/>
-      </w:pPr>
-      <w:r>
-        <w:t>Built containerized AI services using FastAPI, PostgreSQL, and Docker.</w:t>
-      </w:r>
-    </w:p>
-    <w:p>
-      <w:pPr>
-        <w:pStyle w:val="ListParagraph"/>
-        <w:numPr>
-          <w:ilvl w:val="0"/>
-          <w:numId w:val="2"/>
-        </w:numPr>
-        <w:spacing w:after="20"/>
-      </w:pPr>
-      <w:r>
-        <w:t>Developed a churn/CLV pipeline achieving 5-fold CV ROC-AUC 0.841, with threshold tuning and SHAP explainability.</w:t>
-      </w:r>
-    </w:p>
-    <w:p>
-      <w:pPr>
-        <w:pStyle w:val="ListParagraph"/>
-        <w:numPr>
-          <w:ilvl w:val="0"/>
-          <w:numId w:val="2"/>
-        </w:numPr>
-        <w:spacing w:after="20"/>
-      </w:pPr>
-      <w:r>
-        <w:t>Applied Random Forest, XGBoost, Bayesian inference, Gaussian processes, clustering, and forecasting across applied datasets.</w:t>
-      </w:r>
-    </w:p>
-    <w:p>
-      <w:pPr>
-        <w:pStyle w:val="ListParagraph"/>
-        <w:numPr>
-          <w:ilvl w:val="0"/>
-          <w:numId w:val="2"/>
-        </w:numPr>
-        <w:spacing w:after="20"/>
-      </w:pPr>
-      <w:r>
-        <w:t>Worked with UCI Online Retail II (~500K transactions) for segmentation and forecasting, achieving MASE 2.44 with a four-model ensemble.</w:t>
-      </w:r>
-    </w:p>
-    <w:p>
-      <w:pPr>
-        <w:tabs>
-          <w:tab w:val="right" w:pos="10080"/>
-        </w:tabs>
-        <w:spacing w:before="120" w:after="15"/>
-      </w:pPr>
-      <w:r>
-        <w:rPr>
-          <w:b/>
-          <w:bCs/>
-          <w:sz w:val="21"/>
-          <w:szCs w:val="21"/>
-        </w:rPr>
-        <w:t>NSSR DataCamp Fellow — Cohort 2</w:t>
-      </w:r>
-      <w:r>
-        <w:rPr>
-          <w:i/>
-          <w:iCs/>
-          <w:color w:val="333333"/>
-        </w:rPr>
-        <w:tab/>
-        <w:t>2026 – Present</w:t>
-      </w:r>
-    </w:p>
-    <w:p>
-      <w:pPr>
-        <w:spacing w:after="15"/>
-      </w:pPr>
-      <w:r>
-        <w:rPr>
-          <w:i/>
-          <w:iCs/>
-          <w:color w:val="333333"/>
-        </w:rPr>
         <w:t>Nepalese Society of Student Researchers</w:t>
       </w:r>
     </w:p>
@@ -795,19 +871,13 @@
         <w:spacing w:after="20"/>
       </w:pPr>
       <w:r>
-        <w:lastRenderedPageBreak/>
         <w:t>Completed coursework toward SQL Associate and Python Data Associate certifications in PostgreSQL, Pandas, statistics, and scikit-learn.</w:t>
       </w:r>
     </w:p>
     <w:p>
       <w:pPr>
-        <w:pBdr>
-          <w:bottom w:val="single" w:sz="6" w:space="2" w:color="1F3864"/>
-        </w:pBdr>
-        <w:spacing w:before="180" w:after="70"/>
-      </w:pPr>
-      <w:r>
-        <w:rPr>
+        <w:rPr>
+          <w:rFonts w:cs="Times New Roman"/>
           <w:b/>
           <w:bCs/>
           <w:color w:val="1F3864"/>
@@ -815,379 +885,10 @@
           <w:sz w:val="22"/>
           <w:szCs w:val="22"/>
         </w:rPr>
-        <w:t>PROJECTS</w:t>
-      </w:r>
-    </w:p>
-    <w:p>
-      <w:pPr>
-        <w:spacing w:before="100" w:after="8"/>
-      </w:pPr>
-      <w:r>
-        <w:rPr>
-          <w:b/>
-          <w:bCs/>
-          <w:sz w:val="21"/>
-          <w:szCs w:val="21"/>
-        </w:rPr>
-        <w:t>BiasAperture — Vision Fairness &amp; Bias Audit (Fellowship Capstone)</w:t>
-      </w:r>
-    </w:p>
-    <w:p>
-      <w:pPr>
-        <w:spacing w:after="30"/>
-      </w:pPr>
-      <w:r>
-        <w:rPr>
-          <w:i/>
-          <w:iCs/>
-          <w:color w:val="333333"/>
-          <w:sz w:val="19"/>
-          <w:szCs w:val="19"/>
-        </w:rPr>
-        <w:t>AIF360 · Fairlearn · FairFace · UTKFace · SHAP · Statistical Testing</w:t>
-      </w:r>
-    </w:p>
-    <w:p>
-      <w:pPr>
-        <w:pStyle w:val="ListParagraph"/>
-        <w:numPr>
-          <w:ilvl w:val="0"/>
-          <w:numId w:val="2"/>
-        </w:numPr>
-        <w:spacing w:after="20"/>
-      </w:pPr>
-      <w:r>
-        <w:t>Developed a fairness-auditing framework for facial-analysis classifiers, generating structured reports aligned with EU AI Act Article 10 and NIST AI RMF concepts.</w:t>
-      </w:r>
-    </w:p>
-    <w:p>
-      <w:pPr>
-        <w:pStyle w:val="ListParagraph"/>
-        <w:numPr>
-          <w:ilvl w:val="0"/>
-          <w:numId w:val="2"/>
-        </w:numPr>
-        <w:spacing w:after="20"/>
-      </w:pPr>
-      <w:r>
-        <w:t>Computes DPD, EOD, EOP, and DIR across 126 demographic bins (race × age × gender) with χ² significance tests and BCa bootstrap confidence intervals.</w:t>
-      </w:r>
-    </w:p>
-    <w:p>
-      <w:pPr>
-        <w:pStyle w:val="ListParagraph"/>
-        <w:numPr>
-          <w:ilvl w:val="0"/>
-          <w:numId w:val="2"/>
-        </w:numPr>
-        <w:spacing w:after="20"/>
-      </w:pPr>
-      <w:r>
-        <w:t>Fusemachines AI Fellowship Capstone, two-person team with Tisha Manandhar; 4 of 5 milestones complete (Schema Lock through Statistical Engine).</w:t>
-      </w:r>
-    </w:p>
-    <w:p>
-      <w:pPr>
-        <w:spacing w:before="100" w:after="8"/>
-      </w:pPr>
-      <w:r>
-        <w:rPr>
-          <w:b/>
-          <w:bCs/>
-          <w:sz w:val="21"/>
-          <w:szCs w:val="21"/>
-        </w:rPr>
-        <w:t>SPARK — Wearable Fall Detection System (Major Project)</w:t>
-      </w:r>
-    </w:p>
-    <w:p>
-      <w:pPr>
-        <w:spacing w:after="30"/>
-      </w:pPr>
-      <w:r>
-        <w:rPr>
-          <w:i/>
-          <w:iCs/>
-          <w:color w:val="333333"/>
-          <w:sz w:val="19"/>
-          <w:szCs w:val="19"/>
-        </w:rPr>
-        <w:t>ESP32-S3 · TensorFlow Lite Micro · SHAP · MQTT · FastAPI · PostgreSQL</w:t>
-      </w:r>
-    </w:p>
-    <w:p>
-      <w:pPr>
-        <w:pStyle w:val="ListParagraph"/>
-        <w:numPr>
-          <w:ilvl w:val="0"/>
-          <w:numId w:val="2"/>
-        </w:numPr>
-        <w:spacing w:after="20"/>
-      </w:pPr>
-      <w:r>
-        <w:t>Designed a two-layer ESP32-S3 fall-detection system combining a &lt;5ms threshold gate with an INT8 1D CNN confirmation layer under 100ms, reaching 0.919 AUC-ROC on the SisFall benchmark (subject-grouped 5-fold CV, 38,420 windows).</w:t>
-      </w:r>
-    </w:p>
-    <w:p>
-      <w:pPr>
-        <w:pStyle w:val="ListParagraph"/>
-        <w:numPr>
-          <w:ilvl w:val="0"/>
-          <w:numId w:val="2"/>
-        </w:numPr>
-        <w:spacing w:after="20"/>
-      </w:pPr>
-      <w:r>
-        <w:t>Computes per-event SHAP explanations at a local, non-cloud gateway; proposal presented to the review panel, demo targeted for March 2027.</w:t>
-      </w:r>
-    </w:p>
-    <w:p>
-      <w:pPr>
-        <w:pStyle w:val="ListParagraph"/>
-        <w:numPr>
-          <w:ilvl w:val="0"/>
-          <w:numId w:val="2"/>
-        </w:numPr>
-        <w:spacing w:after="20"/>
-      </w:pPr>
-      <w:r>
-        <w:t>Led the AI and backend work package (WP 1.0) — CNN training pipeline, FastAPI/PostgreSQL gateway — within a 4-person team supervised by Er. Dipen Manandhar.</w:t>
-      </w:r>
-    </w:p>
-    <w:p>
-      <w:pPr>
-        <w:spacing w:before="100" w:after="8"/>
-      </w:pPr>
-      <w:r>
-        <w:rPr>
-          <w:b/>
-          <w:bCs/>
-          <w:sz w:val="21"/>
-          <w:szCs w:val="21"/>
-        </w:rPr>
-        <w:t>Gesture-Controlled Self-Balancing Robot (GCSBR) — Minor Project</w:t>
-      </w:r>
-    </w:p>
-    <w:p>
-      <w:pPr>
-        <w:spacing w:after="30"/>
-      </w:pPr>
-      <w:r>
-        <w:rPr>
-          <w:i/>
-          <w:iCs/>
-          <w:color w:val="333333"/>
-          <w:sz w:val="19"/>
-          <w:szCs w:val="19"/>
-        </w:rPr>
-        <w:t>Computer Vision · Arduino · MPU6050 · Stepper Motors · Android · MATLAB</w:t>
-      </w:r>
-      <w:bookmarkStart w:id="0" w:name="_GoBack"/>
-      <w:bookmarkEnd w:id="0"/>
-    </w:p>
-    <w:p>
-      <w:pPr>
-        <w:pStyle w:val="ListParagraph"/>
-        <w:numPr>
-          <w:ilvl w:val="0"/>
-          <w:numId w:val="2"/>
-        </w:numPr>
-        <w:spacing w:after="20"/>
-      </w:pPr>
-      <w:r>
-        <w:t>Implemented PID stabilization firmware, validated via a MATLAB-simulation-to-hardware pipeline.</w:t>
-      </w:r>
-    </w:p>
-    <w:p>
-      <w:pPr>
-        <w:pStyle w:val="ListParagraph"/>
-        <w:numPr>
-          <w:ilvl w:val="0"/>
-          <w:numId w:val="2"/>
-        </w:numPr>
-        <w:spacing w:after="20"/>
-      </w:pPr>
-      <w:r>
-        <w:t>Developed an Android gesture-control app (MediaPipe, CameraX, HC-05 BT) driving motors for real-time actuation.</w:t>
-      </w:r>
-    </w:p>
-    <w:p>
-      <w:pPr>
-        <w:spacing w:before="100" w:after="8"/>
-      </w:pPr>
-      <w:r>
-        <w:rPr>
-          <w:b/>
-          <w:bCs/>
-          <w:sz w:val="21"/>
-          <w:szCs w:val="21"/>
-        </w:rPr>
-        <w:t>Edge AI Stability Detection System</w:t>
-      </w:r>
-    </w:p>
-    <w:p>
-      <w:pPr>
-        <w:spacing w:after="30"/>
-      </w:pPr>
-      <w:r>
-        <w:rPr>
-          <w:i/>
-          <w:iCs/>
-          <w:color w:val="333333"/>
-          <w:sz w:val="19"/>
-          <w:szCs w:val="19"/>
-        </w:rPr>
-        <w:t>Python · Scikit-learn · FastAPI · Joblib</w:t>
-      </w:r>
-    </w:p>
-    <w:p>
-      <w:pPr>
-        <w:pStyle w:val="ListParagraph"/>
-        <w:numPr>
-          <w:ilvl w:val="0"/>
-          <w:numId w:val="2"/>
-        </w:numPr>
-        <w:spacing w:after="20"/>
-      </w:pPr>
-      <w:r>
-        <w:t>Predicted platform stability from simulated IMU data using a Random Forest model, reaching 99.8% test accuracy; served via FastAPI with Joblib export for integration into GCSBR.</w:t>
-      </w:r>
-    </w:p>
-    <w:p>
-      <w:pPr>
-        <w:spacing w:before="100" w:after="8"/>
-      </w:pPr>
-      <w:r>
-        <w:rPr>
-          <w:b/>
-          <w:bCs/>
-          <w:sz w:val="21"/>
-          <w:szCs w:val="21"/>
-        </w:rPr>
-        <w:t>Alpha Android Super-App</w:t>
-      </w:r>
-    </w:p>
-    <w:p>
-      <w:pPr>
-        <w:spacing w:after="30"/>
-      </w:pPr>
-      <w:r>
-        <w:rPr>
-          <w:i/>
-          <w:iCs/>
-          <w:color w:val="333333"/>
-          <w:sz w:val="19"/>
-          <w:szCs w:val="19"/>
-        </w:rPr>
-        <w:t>Kotlin · Jetpack Compose · Material3 · DataStore · Apache POI</w:t>
-      </w:r>
-    </w:p>
-    <w:p>
-      <w:pPr>
-        <w:pStyle w:val="ListParagraph"/>
-        <w:numPr>
-          <w:ilvl w:val="0"/>
-          <w:numId w:val="2"/>
-        </w:numPr>
-        <w:spacing w:after="20"/>
-      </w:pPr>
-      <w:r>
-        <w:t>Modular Android super-app (Kotlin/Jetpack Compose, Material3) — gesture remote, budget tracker, and multi-mode calculator; calculator is the primary shipping target, with Play Store release in progress.</w:t>
-      </w:r>
-    </w:p>
-    <w:p>
-      <w:pPr>
-        <w:spacing w:before="100" w:after="8"/>
-      </w:pPr>
-      <w:r>
-        <w:rPr>
-          <w:b/>
-          <w:bCs/>
-          <w:sz w:val="21"/>
-          <w:szCs w:val="21"/>
-        </w:rPr>
-        <w:t>Nexus — Personal AI Operating System</w:t>
-      </w:r>
-    </w:p>
-    <w:p>
-      <w:pPr>
-        <w:spacing w:after="30"/>
-      </w:pPr>
-      <w:r>
-        <w:rPr>
-          <w:i/>
-          <w:iCs/>
-          <w:color w:val="333333"/>
-          <w:sz w:val="19"/>
-          <w:szCs w:val="19"/>
-        </w:rPr>
-        <w:t>React (Vite) · FastAPI · SQLite + FTS5 · httpx · asyncio</w:t>
-      </w:r>
-    </w:p>
-    <w:p>
-      <w:pPr>
-        <w:pStyle w:val="ListParagraph"/>
-        <w:numPr>
-          <w:ilvl w:val="0"/>
-          <w:numId w:val="2"/>
-        </w:numPr>
-        <w:spacing w:after="20"/>
-      </w:pPr>
-      <w:r>
-        <w:t>Unified Groq (Llama 3.3 70B) and Gemini into an AI workspace via parallel fan-out routing, with SQLite + FTS5 context injection.</w:t>
-      </w:r>
-    </w:p>
-    <w:p>
-      <w:pPr>
-        <w:spacing w:before="100" w:after="8"/>
-      </w:pPr>
-      <w:r>
-        <w:rPr>
-          <w:b/>
-          <w:bCs/>
-          <w:sz w:val="21"/>
-          <w:szCs w:val="21"/>
-        </w:rPr>
-        <w:t>Super-NLM — Multi-Account NotebookLM Hub &amp; MCP Server</w:t>
-      </w:r>
-    </w:p>
-    <w:p>
-      <w:pPr>
-        <w:spacing w:after="30"/>
-      </w:pPr>
-      <w:r>
-        <w:rPr>
-          <w:i/>
-          <w:iCs/>
-          <w:color w:val="333333"/>
-          <w:sz w:val="19"/>
-          <w:szCs w:val="19"/>
-        </w:rPr>
-        <w:t>Python · MCP · NotebookLM · FastAPI · Round-Robin Rate-Limit Routing</w:t>
-      </w:r>
-    </w:p>
-    <w:p>
-      <w:pPr>
-        <w:pStyle w:val="ListParagraph"/>
-        <w:numPr>
-          <w:ilvl w:val="0"/>
-          <w:numId w:val="2"/>
-        </w:numPr>
-        <w:spacing w:after="20"/>
-      </w:pPr>
-      <w:r>
-        <w:t>Built an MCP-enabled dashboard for parallel NotebookLM access across N Google accounts, with round-robin account routing and quota cooldown.</w:t>
-      </w:r>
-    </w:p>
-    <w:p>
-      <w:pPr>
-        <w:pBdr>
-          <w:bottom w:val="single" w:sz="6" w:space="2" w:color="1F3864"/>
-        </w:pBdr>
-        <w:spacing w:before="180" w:after="70"/>
-      </w:pPr>
-      <w:r>
-        <w:rPr>
+      </w:pPr>
+      <w:r>
+        <w:rPr>
+          <w:rFonts w:cs="Times New Roman"/>
           <w:b/>
           <w:bCs/>
           <w:color w:val="1F3864"/>
@@ -1195,97 +896,7 @@
           <w:sz w:val="22"/>
           <w:szCs w:val="22"/>
         </w:rPr>
-        <w:t>SKILLS</w:t>
-      </w:r>
-    </w:p>
-    <w:p>
-      <w:pPr>
-        <w:spacing w:after="30"/>
-      </w:pPr>
-      <w:r>
-        <w:rPr>
-          <w:b/>
-          <w:bCs/>
-        </w:rPr>
-        <w:t xml:space="preserve">Programming: </w:t>
-      </w:r>
-      <w:r>
-        <w:t>Python, C, C++, Kotlin, SQL, VHDL</w:t>
-      </w:r>
-    </w:p>
-    <w:p>
-      <w:pPr>
-        <w:spacing w:after="30"/>
-      </w:pPr>
-      <w:r>
-        <w:rPr>
-          <w:b/>
-          <w:bCs/>
-        </w:rPr>
-        <w:t xml:space="preserve">AI/ML: </w:t>
-      </w:r>
-      <w:r>
-        <w:t>scikit-learn, XGBoost, Random Forest, SHAP, AIF360, Fairlearn, PyMC, ArviZ, pgmpy, clustering, forecasting</w:t>
-      </w:r>
-    </w:p>
-    <w:p>
-      <w:pPr>
-        <w:spacing w:after="30"/>
-      </w:pPr>
-      <w:r>
-        <w:rPr>
-          <w:b/>
-          <w:bCs/>
-        </w:rPr>
-        <w:t xml:space="preserve">AI Systems: </w:t>
-      </w:r>
-      <w:r>
-        <w:t>FastAPI, Docker, PostgreSQL, SQLite/FTS5, REST APIs, asyncio, MCP</w:t>
-      </w:r>
-    </w:p>
-    <w:p>
-      <w:pPr>
-        <w:spacing w:after="30"/>
-      </w:pPr>
-      <w:r>
-        <w:rPr>
-          <w:b/>
-          <w:bCs/>
-        </w:rPr>
-        <w:t xml:space="preserve">Computer Vision/Mobile: </w:t>
-      </w:r>
-      <w:r>
-        <w:t>OpenCV, MediaPipe, CameraX, Kotlin, Jetpack Compose</w:t>
-      </w:r>
-    </w:p>
-    <w:p>
-      <w:pPr>
-        <w:spacing w:after="30"/>
-      </w:pPr>
-      <w:r>
-        <w:rPr>
-          <w:b/>
-          <w:bCs/>
-        </w:rPr>
-        <w:t xml:space="preserve">Embedded/Robotics: </w:t>
-      </w:r>
-      <w:r>
-        <w:t>ESP32-S3, Arduino, MPU6050, Stepper Motors, UART, MQTT, FPGA/Vivado</w:t>
-      </w:r>
-    </w:p>
-    <w:p>
-      <w:pPr>
-        <w:spacing w:after="30"/>
-      </w:pPr>
-      <w:r>
-        <w:rPr>
-          <w:b/>
-          <w:bCs/>
-        </w:rPr>
-        <w:t xml:space="preserve">Tools: </w:t>
-      </w:r>
-      <w:r>
-        <w:t>Git, GitHub, MATLAB, Jupyter, Colab, LaTeX/Overleaf</w:t>
+        <w:br w:type="page"/>
       </w:r>
     </w:p>
     <w:p>
@@ -1294,9 +905,13 @@
           <w:bottom w:val="single" w:sz="6" w:space="2" w:color="1F3864"/>
         </w:pBdr>
         <w:spacing w:before="180" w:after="70"/>
-      </w:pPr>
-      <w:r>
-        <w:rPr>
+        <w:rPr>
+          <w:rFonts w:cs="Times New Roman"/>
+        </w:rPr>
+      </w:pPr>
+      <w:r>
+        <w:rPr>
+          <w:rFonts w:cs="Times New Roman"/>
           <w:b/>
           <w:bCs/>
           <w:color w:val="1F3864"/>
@@ -1304,44 +919,543 @@
           <w:sz w:val="22"/>
           <w:szCs w:val="22"/>
         </w:rPr>
-        <w:t>CERTIFICATIONS &amp; ACTIVITIES</w:t>
-      </w:r>
-    </w:p>
-    <w:p>
-      <w:pPr>
-        <w:spacing w:after="80"/>
-      </w:pPr>
-      <w:r>
-        <w:rPr>
-          <w:sz w:val="19"/>
-          <w:szCs w:val="19"/>
-        </w:rPr>
-        <w:t>IEEE WIE Nepal LaTeX Workshop (May 2026) · IEEE SPAx organizing team · Prompt Engineering Fundamentals, TechAxis · IEEEXtreme 19.0 (Team ShadowXTREME) · PCB Design &amp; Fabrication Workshop, KEC Robotics Club · AWS Cloud Computing Workshop · Microsoft Learn Student Ambassador</w:t>
-      </w:r>
-    </w:p>
-    <w:p>
-      <w:pPr>
-        <w:spacing w:before="60"/>
-      </w:pPr>
-      <w:r>
-        <w:rPr>
+        <w:lastRenderedPageBreak/>
+        <w:t>PROJECTS</w:t>
+      </w:r>
+    </w:p>
+    <w:p>
+      <w:pPr>
+        <w:spacing w:before="100" w:after="8"/>
+        <w:rPr>
+          <w:rFonts w:cs="Times New Roman"/>
+        </w:rPr>
+      </w:pPr>
+      <w:r>
+        <w:rPr>
+          <w:rFonts w:cs="Times New Roman"/>
+          <w:b/>
+          <w:sz w:val="21"/>
+        </w:rPr>
+        <w:t>BiasAperture — Vision Fairness &amp; Bias Audit (Fellowship Capstone)</w:t>
+      </w:r>
+    </w:p>
+    <w:p>
+      <w:pPr>
+        <w:spacing w:after="30"/>
+        <w:rPr>
+          <w:rFonts w:cs="Times New Roman"/>
+        </w:rPr>
+      </w:pPr>
+      <w:r>
+        <w:rPr>
+          <w:rFonts w:cs="Times New Roman"/>
+          <w:i/>
+        </w:rPr>
+        <w:t>AIF360 · Fairlearn · FairFace · SHAP · Statistical Testing</w:t>
+      </w:r>
+    </w:p>
+    <w:p>
+      <w:pPr>
+        <w:pStyle w:val="ListParagraph"/>
+        <w:numPr>
+          <w:ilvl w:val="0"/>
+          <w:numId w:val="2"/>
+        </w:numPr>
+        <w:spacing w:after="20"/>
+      </w:pPr>
+      <w:r>
+        <w:t>Developed a diagnostic fairness-auditing framework with dual AIF360/Fairlearn backends computing DPD, DIR, EOP, and EOD, with harmonized metric definitions and deterministic report generation.</w:t>
+      </w:r>
+    </w:p>
+    <w:p>
+      <w:pPr>
+        <w:pStyle w:val="ListParagraph"/>
+        <w:numPr>
+          <w:ilvl w:val="0"/>
+          <w:numId w:val="2"/>
+        </w:numPr>
+        <w:spacing w:after="20"/>
+      </w:pPr>
+      <w:r>
+        <w:t>Validated on the FairFace benchmark (97,698 images) with BCa bootstrap confidence intervals (B ≥ 1,000), χ²/Fisher testing, n ≥ 30 safeguards, and Shapley attribution for flagged disparities.</w:t>
+      </w:r>
+    </w:p>
+    <w:p>
+      <w:pPr>
+        <w:pStyle w:val="ListParagraph"/>
+        <w:numPr>
+          <w:ilvl w:val="0"/>
+          <w:numId w:val="2"/>
+        </w:numPr>
+        <w:spacing w:after="20"/>
+      </w:pPr>
+      <w:r>
+        <w:t>Co-authored with Tisha Manandhar; M1–M4 completed, M5 System Orchestration &amp; Case Studies at 95%, with 78/78 repository tests passing.</w:t>
+      </w:r>
+    </w:p>
+    <w:p>
+      <w:pPr>
+        <w:spacing w:before="100" w:after="8"/>
+        <w:rPr>
+          <w:rFonts w:cs="Times New Roman"/>
+        </w:rPr>
+      </w:pPr>
+      <w:r>
+        <w:rPr>
+          <w:rFonts w:cs="Times New Roman"/>
+          <w:b/>
+          <w:sz w:val="21"/>
+        </w:rPr>
+        <w:t>SPARK — Wearable Fall Detection System (Major Project)</w:t>
+      </w:r>
+    </w:p>
+    <w:p>
+      <w:pPr>
+        <w:spacing w:after="30"/>
+        <w:rPr>
+          <w:rFonts w:cs="Times New Roman"/>
+        </w:rPr>
+      </w:pPr>
+      <w:r>
+        <w:rPr>
+          <w:rFonts w:cs="Times New Roman"/>
+          <w:i/>
+        </w:rPr>
+        <w:t>ESP32-S3 · 1D CNN · TensorFlow Lite Micro · SHAP · BLE · FastAPI</w:t>
+      </w:r>
+    </w:p>
+    <w:p>
+      <w:pPr>
+        <w:pStyle w:val="ListParagraph"/>
+        <w:numPr>
+          <w:ilvl w:val="0"/>
+          <w:numId w:val="2"/>
+        </w:numPr>
+        <w:spacing w:after="20"/>
+      </w:pPr>
+      <w:r>
+        <w:t>Developed the ML pipeline on SisFall with subject-grouped 5-fold cross-validation, achieving 0.9185 AUC-ROC (38,420 windows) and 87.81% sensitivity; built an INT8 post-training quantizer exporting an 18.5 KB TFLite Micro model.</w:t>
+      </w:r>
+    </w:p>
+    <w:p>
+      <w:pPr>
+        <w:pStyle w:val="ListParagraph"/>
+        <w:numPr>
+          <w:ilvl w:val="0"/>
+          <w:numId w:val="2"/>
+        </w:numPr>
+        <w:spacing w:after="20"/>
+      </w:pPr>
+      <w:r>
+        <w:t>Built the local BLE/serial gateway, SHAP attribution pipeline, JSON event store, PDF reporting, and REST dashboard; led ML modeling, quantization, and gateway work in a 4-person team.</w:t>
+      </w:r>
+    </w:p>
+    <w:p>
+      <w:pPr>
+        <w:pStyle w:val="ListParagraph"/>
+        <w:numPr>
+          <w:ilvl w:val="0"/>
+          <w:numId w:val="2"/>
+        </w:numPr>
+        <w:spacing w:after="20"/>
+      </w:pPr>
+      <w:r>
+        <w:t>Repository test suite reports 48/48 passing; physical hardware bring-up, on-device BLE validation, and final deployment remain in the project roadmap.</w:t>
+      </w:r>
+    </w:p>
+    <w:p>
+      <w:pPr>
+        <w:spacing w:before="100" w:after="8"/>
+        <w:rPr>
+          <w:rFonts w:cs="Times New Roman"/>
+        </w:rPr>
+      </w:pPr>
+      <w:r>
+        <w:rPr>
+          <w:rFonts w:cs="Times New Roman"/>
+          <w:b/>
+          <w:bCs/>
+          <w:sz w:val="21"/>
+          <w:szCs w:val="21"/>
+        </w:rPr>
+        <w:t>Gesture-Controlled Self-Balancing Robot (GCSBR) — Minor Project</w:t>
+      </w:r>
+    </w:p>
+    <w:p>
+      <w:pPr>
+        <w:spacing w:after="30"/>
+        <w:rPr>
+          <w:rFonts w:cs="Times New Roman"/>
+        </w:rPr>
+      </w:pPr>
+      <w:r>
+        <w:rPr>
+          <w:rFonts w:cs="Times New Roman"/>
           <w:i/>
           <w:iCs/>
           <w:color w:val="333333"/>
-          <w:sz w:val="18"/>
-          <w:szCs w:val="18"/>
-        </w:rPr>
-        <w:t xml:space="preserve">Active in IEEE KEC, EPC, KEC Maker’s Space, and KEC Music Club. </w:t>
-      </w:r>
-      <w:r>
-        <w:rPr>
+          <w:sz w:val="19"/>
+          <w:szCs w:val="19"/>
+        </w:rPr>
+        <w:t>Computer Vision · Arduino · MPU6050 · Stepper Motors · Android · MATLAB</w:t>
+      </w:r>
+    </w:p>
+    <w:p>
+      <w:pPr>
+        <w:pStyle w:val="ListParagraph"/>
+        <w:numPr>
+          <w:ilvl w:val="0"/>
+          <w:numId w:val="2"/>
+        </w:numPr>
+        <w:spacing w:after="20"/>
+      </w:pPr>
+      <w:r>
+        <w:t>Implemented PID stabilization firmware, validated via a MATLAB-simulation-to-hardware pipeline.</w:t>
+      </w:r>
+    </w:p>
+    <w:p>
+      <w:pPr>
+        <w:pStyle w:val="ListParagraph"/>
+        <w:numPr>
+          <w:ilvl w:val="0"/>
+          <w:numId w:val="2"/>
+        </w:numPr>
+        <w:spacing w:after="20"/>
+      </w:pPr>
+      <w:r>
+        <w:t>Developed an Android gesture-control app (MediaPipe, CameraX, HC-05 BT) driving motors for real-time actuation.</w:t>
+      </w:r>
+    </w:p>
+    <w:p>
+      <w:pPr>
+        <w:spacing w:before="100" w:after="8"/>
+        <w:rPr>
+          <w:rFonts w:cs="Times New Roman"/>
+        </w:rPr>
+      </w:pPr>
+      <w:r>
+        <w:rPr>
+          <w:rFonts w:cs="Times New Roman"/>
+          <w:b/>
+          <w:sz w:val="21"/>
+        </w:rPr>
+        <w:t>Edge AI Stability Detection System — GCSBR Support Project</w:t>
+      </w:r>
+    </w:p>
+    <w:p>
+      <w:pPr>
+        <w:spacing w:after="30"/>
+        <w:rPr>
+          <w:rFonts w:cs="Times New Roman"/>
+        </w:rPr>
+      </w:pPr>
+      <w:r>
+        <w:rPr>
+          <w:rFonts w:cs="Times New Roman"/>
           <w:i/>
-          <w:iCs/>
-          <w:color w:val="333333"/>
-          <w:sz w:val="16"/>
-          <w:szCs w:val="16"/>
-        </w:rPr>
-        <w:t>| Last Updated: August 24, 2026</w:t>
+        </w:rPr>
+        <w:t>Python · scikit-learn · FastAPI · Joblib · IMU Data</w:t>
+      </w:r>
+    </w:p>
+    <w:p>
+      <w:pPr>
+        <w:pStyle w:val="ListParagraph"/>
+        <w:numPr>
+          <w:ilvl w:val="0"/>
+          <w:numId w:val="2"/>
+        </w:numPr>
+        <w:spacing w:after="20"/>
+      </w:pPr>
+      <w:r>
+        <w:t>Predicted platform stability from simulated IMU data using a Random Forest model, reaching 99.8% test accuracy; served the persisted model via FastAPI with Joblib export for integration into GCSBR.</w:t>
+      </w:r>
+    </w:p>
+    <w:p>
+      <w:pPr>
+        <w:spacing w:before="100" w:after="8"/>
+        <w:rPr>
+          <w:rFonts w:cs="Times New Roman"/>
+        </w:rPr>
+      </w:pPr>
+      <w:r>
+        <w:rPr>
+          <w:rFonts w:cs="Times New Roman"/>
+          <w:b/>
+          <w:sz w:val="21"/>
+        </w:rPr>
+        <w:t>Headless Invariant Assurance Engine (INV-BMK-001)</w:t>
+      </w:r>
+    </w:p>
+    <w:p>
+      <w:pPr>
+        <w:spacing w:after="30"/>
+        <w:rPr>
+          <w:rFonts w:cs="Times New Roman"/>
+        </w:rPr>
+      </w:pPr>
+      <w:r>
+        <w:rPr>
+          <w:rFonts w:cs="Times New Roman"/>
+          <w:i/>
+        </w:rPr>
+        <w:t>Python · Z3 · SMT-LIB2 · State Machines · Sandbox Replay · Pytest</w:t>
+      </w:r>
+    </w:p>
+    <w:p>
+      <w:pPr>
+        <w:pStyle w:val="ListParagraph"/>
+        <w:numPr>
+          <w:ilvl w:val="0"/>
+          <w:numId w:val="2"/>
+        </w:numPr>
+        <w:spacing w:after="20"/>
+      </w:pPr>
+      <w:r>
+        <w:t>Developed a formal verification benchmark that encodes state-machine contracts into SMT-LIB2/Z3, proves candidate invariants inductively, generates counterexamples, and replays them in a concrete Python sandbox; latest run evaluated 12 properties across 4 state machines, discovered and replay-confirmed 4/4 planted violations (100% recall), recorded 0.0% false-discovery rate, and measured 10.844 ms mean solver latency.</w:t>
+      </w:r>
+    </w:p>
+    <w:p>
+      <w:pPr>
+        <w:spacing w:before="100" w:after="8"/>
+        <w:rPr>
+          <w:rFonts w:cs="Times New Roman"/>
+        </w:rPr>
+      </w:pPr>
+      <w:r>
+        <w:rPr>
+          <w:rFonts w:cs="Times New Roman"/>
+          <w:b/>
+          <w:sz w:val="21"/>
+        </w:rPr>
+        <w:t>nepali-ocr-ai — Low-Resource Document Intelligence</w:t>
+      </w:r>
+    </w:p>
+    <w:p>
+      <w:pPr>
+        <w:spacing w:after="30"/>
+        <w:rPr>
+          <w:rFonts w:cs="Times New Roman"/>
+        </w:rPr>
+      </w:pPr>
+      <w:r>
+        <w:rPr>
+          <w:rFonts w:cs="Times New Roman"/>
+          <w:i/>
+        </w:rPr>
+        <w:t>Python · Multimodal Vision · Tesseract · Devanagari · OpenXML</w:t>
+      </w:r>
+    </w:p>
+    <w:p>
+      <w:pPr>
+        <w:pStyle w:val="ListParagraph"/>
+        <w:numPr>
+          <w:ilvl w:val="0"/>
+          <w:numId w:val="2"/>
+        </w:numPr>
+        <w:spacing w:after="20"/>
+      </w:pPr>
+      <w:r>
+        <w:t>Prototyped a hybrid Nepali document pipeline combining multimodal vision OCR with local Tesseract fallback, Devanagari normalization, and contextual Varnavinyas checks; includes Preeti↔Unicode transcoding and DOCX repair workflows.</w:t>
+      </w:r>
+    </w:p>
+    <w:p>
+      <w:pPr>
+        <w:spacing w:before="100" w:after="8"/>
+        <w:rPr>
+          <w:rFonts w:cs="Times New Roman"/>
+        </w:rPr>
+      </w:pPr>
+      <w:r>
+        <w:rPr>
+          <w:rFonts w:cs="Times New Roman"/>
+          <w:b/>
+          <w:sz w:val="21"/>
+        </w:rPr>
+        <w:t>Super-NLM — Multi-Account NotebookLM Hub &amp; MCP Server</w:t>
+      </w:r>
+    </w:p>
+    <w:p>
+      <w:pPr>
+        <w:spacing w:after="30"/>
+        <w:rPr>
+          <w:rFonts w:cs="Times New Roman"/>
+        </w:rPr>
+      </w:pPr>
+      <w:r>
+        <w:rPr>
+          <w:rFonts w:cs="Times New Roman"/>
+          <w:i/>
+        </w:rPr>
+        <w:t>Python · FastAPI · MCP · NotebookLM · asyncio</w:t>
+      </w:r>
+    </w:p>
+    <w:p>
+      <w:pPr>
+        <w:pStyle w:val="ListParagraph"/>
+        <w:numPr>
+          <w:ilvl w:val="0"/>
+          <w:numId w:val="2"/>
+        </w:numPr>
+        <w:spacing w:after="20"/>
+      </w:pPr>
+      <w:r>
+        <w:t>Built an MCP server and web dashboard for multi-account NotebookLM access with round-robin routing, quota-aware cooldown/retry, multi-turn account pinning, cross-notebook synthesis, folder sync, and scheduled Studio artifact generation.</w:t>
+      </w:r>
+    </w:p>
+    <w:p>
+      <w:pPr>
+        <w:pBdr>
+          <w:bottom w:val="single" w:sz="6" w:space="2" w:color="1F3864"/>
+        </w:pBdr>
+        <w:spacing w:before="180" w:after="70"/>
+        <w:rPr>
+          <w:rFonts w:cs="Times New Roman"/>
+        </w:rPr>
+      </w:pPr>
+      <w:r>
+        <w:rPr>
+          <w:rFonts w:cs="Times New Roman"/>
+          <w:b/>
+          <w:bCs/>
+          <w:color w:val="1F3864"/>
+          <w:spacing w:val="6"/>
+          <w:sz w:val="22"/>
+          <w:szCs w:val="22"/>
+        </w:rPr>
+        <w:t>SKILLS</w:t>
+      </w:r>
+    </w:p>
+    <w:p>
+      <w:pPr>
+        <w:spacing w:after="30"/>
+        <w:rPr>
+          <w:rFonts w:cs="Times New Roman"/>
+        </w:rPr>
+      </w:pPr>
+      <w:r>
+        <w:rPr>
+          <w:rFonts w:cs="Times New Roman"/>
+        </w:rPr>
+        <w:t>Programming: Python, C, C++, SQL, Kotlin, VHDL</w:t>
+      </w:r>
+    </w:p>
+    <w:p>
+      <w:pPr>
+        <w:spacing w:after="30"/>
+        <w:rPr>
+          <w:rFonts w:cs="Times New Roman"/>
+        </w:rPr>
+      </w:pPr>
+      <w:r>
+        <w:rPr>
+          <w:rFonts w:cs="Times New Roman"/>
+        </w:rPr>
+        <w:t>ML/Statistical Learning: PyTorch, TensorFlow, scikit-learn, XGBoost, Random Forest, PyMC, clustering, forecasting</w:t>
+      </w:r>
+    </w:p>
+    <w:p>
+      <w:pPr>
+        <w:spacing w:after="30"/>
+        <w:rPr>
+          <w:rFonts w:cs="Times New Roman"/>
+        </w:rPr>
+      </w:pPr>
+      <w:r>
+        <w:rPr>
+          <w:rFonts w:cs="Times New Roman"/>
+        </w:rPr>
+        <w:t>Fairness/Explainability: SHAP, AIF360, Fairlearn, statistical testing, bootstrap confidence intervals</w:t>
+      </w:r>
+    </w:p>
+    <w:p>
+      <w:pPr>
+        <w:spacing w:after="30"/>
+        <w:rPr>
+          <w:rFonts w:cs="Times New Roman"/>
+        </w:rPr>
+      </w:pPr>
+      <w:r>
+        <w:rPr>
+          <w:rFonts w:cs="Times New Roman"/>
+        </w:rPr>
+        <w:t>AI Systems: FastAPI, Docker, PostgreSQL, SQLite/FTS5, asyncio, MCP</w:t>
+      </w:r>
+    </w:p>
+    <w:p>
+      <w:pPr>
+        <w:spacing w:after="30"/>
+        <w:rPr>
+          <w:rFonts w:cs="Times New Roman"/>
+        </w:rPr>
+      </w:pPr>
+      <w:r>
+        <w:rPr>
+          <w:rFonts w:cs="Times New Roman"/>
+        </w:rPr>
+        <w:t>Computer Vision/Edge AI: OpenCV, MediaPipe, TensorFlow Lite Micro, ONNX, Tesseract</w:t>
+      </w:r>
+    </w:p>
+    <w:p>
+      <w:pPr>
+        <w:spacing w:after="30"/>
+        <w:rPr>
+          <w:rFonts w:cs="Times New Roman"/>
+        </w:rPr>
+      </w:pPr>
+      <w:r>
+        <w:rPr>
+          <w:rFonts w:cs="Times New Roman"/>
+        </w:rPr>
+        <w:t>Formal Methods/Verification: Z3, SMT-LIB2, state-machine verification, deterministic replay, pytest · Embedded/Robotics: ESP-IDF, FreeRTOS, ESP32-S3, Arduino, MPU6050, UART/I2C/SPI, MQTT, FPGA/Vivado · Tools: Git, GitHub, Jupyter, MATLAB, Colab, LaTeX/Overleaf</w:t>
+      </w:r>
+    </w:p>
+    <w:p>
+      <w:pPr>
+        <w:pBdr>
+          <w:bottom w:val="single" w:sz="6" w:space="2" w:color="1F3864"/>
+        </w:pBdr>
+        <w:spacing w:before="180" w:after="70"/>
+        <w:rPr>
+          <w:rFonts w:cs="Times New Roman"/>
+        </w:rPr>
+      </w:pPr>
+      <w:r>
+        <w:rPr>
+          <w:rFonts w:cs="Times New Roman"/>
+          <w:b/>
+          <w:sz w:val="22"/>
+        </w:rPr>
+        <w:t>CERTIFICATIONS &amp; ACTIVITIES</w:t>
+      </w:r>
+    </w:p>
+    <w:p>
+      <w:pPr>
+        <w:spacing w:after="80"/>
+        <w:rPr>
+          <w:rFonts w:cs="Times New Roman"/>
+        </w:rPr>
+      </w:pPr>
+      <w:r>
+        <w:rPr>
+          <w:rFonts w:cs="Times New Roman"/>
+          <w:sz w:val="19"/>
+          <w:szCs w:val="19"/>
+        </w:rPr>
+        <w:t>IEEE WIE Nepal LaTeX Workshop (May 2026) · IEEE SPAx organizing team · Prompt Engineering Fundamentals, TechAxis · IEEEXtreme 19.0 (Team ShadowXTREME) · PCB Design &amp; Fabrication Workshop, KEC Robotics Club · AWS Cloud Computing Workshop · Microsoft Learn Student Ambassador</w:t>
+      </w:r>
+    </w:p>
+    <w:p>
+      <w:pPr>
+        <w:spacing w:before="60"/>
+        <w:rPr>
+          <w:rFonts w:cs="Times New Roman"/>
+        </w:rPr>
+      </w:pPr>
+      <w:r>
+        <w:rPr>
+          <w:rFonts w:cs="Times New Roman"/>
+        </w:rPr>
+        <w:t>Active in IEEE KEC, EPC, KEC Maker’s Space, and KEC Music Club. | Last Updated: September 30, 2026</w:t>
       </w:r>
     </w:p>
     <w:sectPr>

</xml_diff>